<commit_message>
Geschichte 11: Test überarbeitet (Berichtigungsspalte, nur S/W, keine vorweggenommene Antwort)
Co-Authored-By: Claude Opus 5.5 <noreply@anthropic.com>
Claude-Session: https://claude.ai/code/session_013iN4Tiarea1J9YUJHZ9iqC
</commit_message>
<xml_diff>
--- a/Geschichte_11/Doppelstunde_Test_Quellenanalyse/Test_Athen_bis_Peisistratos.docx
+++ b/Geschichte_11/Doppelstunde_Test_Quellenanalyse/Test_Athen_bis_Peisistratos.docx
@@ -285,7 +285,7 @@
           <w:sz w:val="20"/>
           <w:szCs w:val="20"/>
         </w:rPr>
-        <w:t xml:space="preserve">Kreuze an. Berichtige jede falsche Aussage in einem Satz. (je 1 P. fürs Kreuz, je 1 P. für die Berichtigung)</w:t>
+        <w:t xml:space="preserve">Kreuze an. Berichtige jede falsche Aussage in einem Satz in der rechten Spalte. (je 1 P. fürs Kreuz, je 1 P. für die Berichtigung)</w:t>
       </w:r>
     </w:p>
     <w:tbl>
@@ -301,10 +301,10 @@
         </w:tblBorders>
       </w:tblPr>
       <w:tblGrid>
-        <w:gridCol w:w="6700"/>
-        <w:gridCol w:w="900"/>
-        <w:gridCol w:w="900"/>
-        <w:gridCol w:w="1706"/>
+        <w:gridCol w:w="4300"/>
+        <w:gridCol w:w="750"/>
+        <w:gridCol w:w="750"/>
+        <w:gridCol w:w="4406"/>
       </w:tblGrid>
       <w:tr>
         <w:trPr>
@@ -312,7 +312,7 @@
         </w:trPr>
         <w:tc>
           <w:tcPr>
-            <w:tcW w:type="dxa" w:w="6700"/>
+            <w:tcW w:type="dxa" w:w="4300"/>
             <w:tcBorders>
               <w:top w:val="single" w:color="BFB5A5" w:sz="4"/>
               <w:left w:val="single" w:color="BFB5A5" w:sz="4"/>
@@ -346,7 +346,7 @@
         </w:tc>
         <w:tc>
           <w:tcPr>
-            <w:tcW w:type="dxa" w:w="900"/>
+            <w:tcW w:type="dxa" w:w="750"/>
             <w:tcBorders>
               <w:top w:val="single" w:color="BFB5A5" w:sz="4"/>
               <w:left w:val="single" w:color="BFB5A5" w:sz="4"/>
@@ -381,7 +381,7 @@
         </w:tc>
         <w:tc>
           <w:tcPr>
-            <w:tcW w:type="dxa" w:w="900"/>
+            <w:tcW w:type="dxa" w:w="750"/>
             <w:tcBorders>
               <w:top w:val="single" w:color="BFB5A5" w:sz="4"/>
               <w:left w:val="single" w:color="BFB5A5" w:sz="4"/>
@@ -416,7 +416,7 @@
         </w:tc>
         <w:tc>
           <w:tcPr>
-            <w:tcW w:type="dxa" w:w="1706"/>
+            <w:tcW w:type="dxa" w:w="4406"/>
             <w:tcBorders>
               <w:top w:val="single" w:color="BFB5A5" w:sz="4"/>
               <w:left w:val="single" w:color="BFB5A5" w:sz="4"/>
@@ -445,7 +445,1000 @@
                 <w:sz w:val="19"/>
                 <w:szCs w:val="19"/>
               </w:rPr>
+              <w:t xml:space="preserve">Berichtigung (nur bei falschen Aussagen)</w:t>
+            </w:r>
+          </w:p>
+        </w:tc>
+      </w:tr>
+      <w:tr>
+        <w:trPr>
+          <w:cantSplit/>
+          <w:trHeight w:val="840" w:hRule="atLeast"/>
+        </w:trPr>
+        <w:tc>
+          <w:tcPr>
+            <w:tcW w:type="dxa" w:w="4300"/>
+            <w:tcBorders>
+              <w:top w:val="single" w:color="BFB5A5" w:sz="4"/>
+              <w:left w:val="single" w:color="BFB5A5" w:sz="4"/>
+              <w:bottom w:val="single" w:color="BFB5A5" w:sz="4"/>
+              <w:right w:val="single" w:color="BFB5A5" w:sz="4"/>
+            </w:tcBorders>
+            <w:tcMar>
+              <w:top w:type="dxa" w:w="50"/>
+              <w:left w:type="dxa" w:w="90"/>
+              <w:bottom w:type="dxa" w:w="50"/>
+              <w:right w:type="dxa" w:w="90"/>
+            </w:tcMar>
+          </w:tcPr>
+          <w:p>
+            <w:pPr>
+              <w:spacing w:after="0" w:before="0"/>
+            </w:pPr>
+            <w:r>
+              <w:rPr>
+                <w:rFonts w:ascii="Calibri" w:cs="Calibri" w:eastAsia="Calibri" w:hAnsi="Calibri"/>
+                <w:b w:val="false"/>
+                <w:bCs w:val="false"/>
+                <w:color w:val="2B2318"/>
+                <w:sz w:val="19"/>
+                <w:szCs w:val="19"/>
+              </w:rPr>
+              <w:t xml:space="preserve">a) Drakon schrieb das Recht in Athen erstmals auf.</w:t>
+            </w:r>
+          </w:p>
+        </w:tc>
+        <w:tc>
+          <w:tcPr>
+            <w:tcW w:type="dxa" w:w="750"/>
+            <w:tcBorders>
+              <w:top w:val="single" w:color="BFB5A5" w:sz="4"/>
+              <w:left w:val="single" w:color="BFB5A5" w:sz="4"/>
+              <w:bottom w:val="single" w:color="BFB5A5" w:sz="4"/>
+              <w:right w:val="single" w:color="BFB5A5" w:sz="4"/>
+            </w:tcBorders>
+            <w:tcMar>
+              <w:top w:type="dxa" w:w="50"/>
+              <w:left w:type="dxa" w:w="90"/>
+              <w:bottom w:type="dxa" w:w="50"/>
+              <w:right w:type="dxa" w:w="90"/>
+            </w:tcMar>
+          </w:tcPr>
+          <w:p>
+            <w:pPr>
+              <w:spacing w:after="0" w:before="0"/>
+              <w:jc w:val="center"/>
+            </w:pPr>
+            <w:r>
+              <w:rPr>
+                <w:rFonts w:ascii="Calibri" w:cs="Calibri" w:eastAsia="Calibri" w:hAnsi="Calibri"/>
+                <w:b w:val="false"/>
+                <w:bCs w:val="false"/>
+                <w:color w:val="2B2318"/>
+                <w:sz w:val="19"/>
+                <w:szCs w:val="19"/>
+              </w:rPr>
+              <w:t xml:space="preserve">☐</w:t>
+            </w:r>
+          </w:p>
+        </w:tc>
+        <w:tc>
+          <w:tcPr>
+            <w:tcW w:type="dxa" w:w="750"/>
+            <w:tcBorders>
+              <w:top w:val="single" w:color="BFB5A5" w:sz="4"/>
+              <w:left w:val="single" w:color="BFB5A5" w:sz="4"/>
+              <w:bottom w:val="single" w:color="BFB5A5" w:sz="4"/>
+              <w:right w:val="single" w:color="BFB5A5" w:sz="4"/>
+            </w:tcBorders>
+            <w:tcMar>
+              <w:top w:type="dxa" w:w="50"/>
+              <w:left w:type="dxa" w:w="90"/>
+              <w:bottom w:type="dxa" w:w="50"/>
+              <w:right w:type="dxa" w:w="90"/>
+            </w:tcMar>
+          </w:tcPr>
+          <w:p>
+            <w:pPr>
+              <w:spacing w:after="0" w:before="0"/>
+              <w:jc w:val="center"/>
+            </w:pPr>
+            <w:r>
+              <w:rPr>
+                <w:rFonts w:ascii="Calibri" w:cs="Calibri" w:eastAsia="Calibri" w:hAnsi="Calibri"/>
+                <w:b w:val="false"/>
+                <w:bCs w:val="false"/>
+                <w:color w:val="2B2318"/>
+                <w:sz w:val="19"/>
+                <w:szCs w:val="19"/>
+              </w:rPr>
+              <w:t xml:space="preserve">☐</w:t>
+            </w:r>
+          </w:p>
+        </w:tc>
+        <w:tc>
+          <w:tcPr>
+            <w:tcW w:type="dxa" w:w="4406"/>
+            <w:tcBorders>
+              <w:top w:val="single" w:color="BFB5A5" w:sz="4"/>
+              <w:left w:val="single" w:color="BFB5A5" w:sz="4"/>
+              <w:bottom w:val="single" w:color="BFB5A5" w:sz="4"/>
+              <w:right w:val="single" w:color="BFB5A5" w:sz="4"/>
+            </w:tcBorders>
+            <w:tcMar>
+              <w:top w:type="dxa" w:w="50"/>
+              <w:left w:type="dxa" w:w="90"/>
+              <w:bottom w:type="dxa" w:w="50"/>
+              <w:right w:type="dxa" w:w="90"/>
+            </w:tcMar>
+          </w:tcPr>
+          <w:p>
+            <w:pPr>
+              <w:spacing w:after="0" w:before="0"/>
+              <w:jc w:val="center"/>
+            </w:pPr>
+            <w:r>
+              <w:rPr>
+                <w:rFonts w:ascii="Calibri" w:cs="Calibri" w:eastAsia="Calibri" w:hAnsi="Calibri"/>
+                <w:b w:val="false"/>
+                <w:bCs w:val="false"/>
+                <w:color w:val="2B2318"/>
+                <w:sz w:val="19"/>
+                <w:szCs w:val="19"/>
+              </w:rPr>
               <w:t xml:space="preserve"/>
+            </w:r>
+          </w:p>
+        </w:tc>
+      </w:tr>
+      <w:tr>
+        <w:trPr>
+          <w:cantSplit/>
+          <w:trHeight w:val="840" w:hRule="atLeast"/>
+        </w:trPr>
+        <w:tc>
+          <w:tcPr>
+            <w:tcW w:type="dxa" w:w="4300"/>
+            <w:tcBorders>
+              <w:top w:val="single" w:color="BFB5A5" w:sz="4"/>
+              <w:left w:val="single" w:color="BFB5A5" w:sz="4"/>
+              <w:bottom w:val="single" w:color="BFB5A5" w:sz="4"/>
+              <w:right w:val="single" w:color="BFB5A5" w:sz="4"/>
+            </w:tcBorders>
+            <w:tcMar>
+              <w:top w:type="dxa" w:w="50"/>
+              <w:left w:type="dxa" w:w="90"/>
+              <w:bottom w:type="dxa" w:w="50"/>
+              <w:right w:type="dxa" w:w="90"/>
+            </w:tcMar>
+          </w:tcPr>
+          <w:p>
+            <w:pPr>
+              <w:spacing w:after="0" w:before="0"/>
+            </w:pPr>
+            <w:r>
+              <w:rPr>
+                <w:rFonts w:ascii="Calibri" w:cs="Calibri" w:eastAsia="Calibri" w:hAnsi="Calibri"/>
+                <w:b w:val="false"/>
+                <w:bCs w:val="false"/>
+                <w:color w:val="2B2318"/>
+                <w:sz w:val="19"/>
+                <w:szCs w:val="19"/>
+              </w:rPr>
+              <w:t xml:space="preserve">b) Drakon schaffte die Schuldknechtschaft ab.</w:t>
+            </w:r>
+          </w:p>
+        </w:tc>
+        <w:tc>
+          <w:tcPr>
+            <w:tcW w:type="dxa" w:w="750"/>
+            <w:tcBorders>
+              <w:top w:val="single" w:color="BFB5A5" w:sz="4"/>
+              <w:left w:val="single" w:color="BFB5A5" w:sz="4"/>
+              <w:bottom w:val="single" w:color="BFB5A5" w:sz="4"/>
+              <w:right w:val="single" w:color="BFB5A5" w:sz="4"/>
+            </w:tcBorders>
+            <w:tcMar>
+              <w:top w:type="dxa" w:w="50"/>
+              <w:left w:type="dxa" w:w="90"/>
+              <w:bottom w:type="dxa" w:w="50"/>
+              <w:right w:type="dxa" w:w="90"/>
+            </w:tcMar>
+          </w:tcPr>
+          <w:p>
+            <w:pPr>
+              <w:spacing w:after="0" w:before="0"/>
+              <w:jc w:val="center"/>
+            </w:pPr>
+            <w:r>
+              <w:rPr>
+                <w:rFonts w:ascii="Calibri" w:cs="Calibri" w:eastAsia="Calibri" w:hAnsi="Calibri"/>
+                <w:b w:val="false"/>
+                <w:bCs w:val="false"/>
+                <w:color w:val="2B2318"/>
+                <w:sz w:val="19"/>
+                <w:szCs w:val="19"/>
+              </w:rPr>
+              <w:t xml:space="preserve">☐</w:t>
+            </w:r>
+          </w:p>
+        </w:tc>
+        <w:tc>
+          <w:tcPr>
+            <w:tcW w:type="dxa" w:w="750"/>
+            <w:tcBorders>
+              <w:top w:val="single" w:color="BFB5A5" w:sz="4"/>
+              <w:left w:val="single" w:color="BFB5A5" w:sz="4"/>
+              <w:bottom w:val="single" w:color="BFB5A5" w:sz="4"/>
+              <w:right w:val="single" w:color="BFB5A5" w:sz="4"/>
+            </w:tcBorders>
+            <w:tcMar>
+              <w:top w:type="dxa" w:w="50"/>
+              <w:left w:type="dxa" w:w="90"/>
+              <w:bottom w:type="dxa" w:w="50"/>
+              <w:right w:type="dxa" w:w="90"/>
+            </w:tcMar>
+          </w:tcPr>
+          <w:p>
+            <w:pPr>
+              <w:spacing w:after="0" w:before="0"/>
+              <w:jc w:val="center"/>
+            </w:pPr>
+            <w:r>
+              <w:rPr>
+                <w:rFonts w:ascii="Calibri" w:cs="Calibri" w:eastAsia="Calibri" w:hAnsi="Calibri"/>
+                <w:b w:val="false"/>
+                <w:bCs w:val="false"/>
+                <w:color w:val="2B2318"/>
+                <w:sz w:val="19"/>
+                <w:szCs w:val="19"/>
+              </w:rPr>
+              <w:t xml:space="preserve">☐</w:t>
+            </w:r>
+          </w:p>
+        </w:tc>
+        <w:tc>
+          <w:tcPr>
+            <w:tcW w:type="dxa" w:w="4406"/>
+            <w:tcBorders>
+              <w:top w:val="single" w:color="BFB5A5" w:sz="4"/>
+              <w:left w:val="single" w:color="BFB5A5" w:sz="4"/>
+              <w:bottom w:val="single" w:color="BFB5A5" w:sz="4"/>
+              <w:right w:val="single" w:color="BFB5A5" w:sz="4"/>
+            </w:tcBorders>
+            <w:tcMar>
+              <w:top w:type="dxa" w:w="50"/>
+              <w:left w:type="dxa" w:w="90"/>
+              <w:bottom w:type="dxa" w:w="50"/>
+              <w:right w:type="dxa" w:w="90"/>
+            </w:tcMar>
+          </w:tcPr>
+          <w:p>
+            <w:pPr>
+              <w:spacing w:after="0" w:before="0"/>
+              <w:jc w:val="center"/>
+            </w:pPr>
+            <w:r>
+              <w:rPr>
+                <w:rFonts w:ascii="Calibri" w:cs="Calibri" w:eastAsia="Calibri" w:hAnsi="Calibri"/>
+                <w:b w:val="false"/>
+                <w:bCs w:val="false"/>
+                <w:color w:val="2B2318"/>
+                <w:sz w:val="19"/>
+                <w:szCs w:val="19"/>
+              </w:rPr>
+              <w:t xml:space="preserve"/>
+            </w:r>
+          </w:p>
+        </w:tc>
+      </w:tr>
+      <w:tr>
+        <w:trPr>
+          <w:cantSplit/>
+          <w:trHeight w:val="840" w:hRule="atLeast"/>
+        </w:trPr>
+        <w:tc>
+          <w:tcPr>
+            <w:tcW w:type="dxa" w:w="4300"/>
+            <w:tcBorders>
+              <w:top w:val="single" w:color="BFB5A5" w:sz="4"/>
+              <w:left w:val="single" w:color="BFB5A5" w:sz="4"/>
+              <w:bottom w:val="single" w:color="BFB5A5" w:sz="4"/>
+              <w:right w:val="single" w:color="BFB5A5" w:sz="4"/>
+            </w:tcBorders>
+            <w:tcMar>
+              <w:top w:type="dxa" w:w="50"/>
+              <w:left w:type="dxa" w:w="90"/>
+              <w:bottom w:type="dxa" w:w="50"/>
+              <w:right w:type="dxa" w:w="90"/>
+            </w:tcMar>
+          </w:tcPr>
+          <w:p>
+            <w:pPr>
+              <w:spacing w:after="0" w:before="0"/>
+            </w:pPr>
+            <w:r>
+              <w:rPr>
+                <w:rFonts w:ascii="Calibri" w:cs="Calibri" w:eastAsia="Calibri" w:hAnsi="Calibri"/>
+                <w:b w:val="false"/>
+                <w:bCs w:val="false"/>
+                <w:color w:val="2B2318"/>
+                <w:sz w:val="19"/>
+                <w:szCs w:val="19"/>
+              </w:rPr>
+              <w:t xml:space="preserve">c) Solon strich die Schulden und kaufte versklavte Bürger zurück.</w:t>
+            </w:r>
+          </w:p>
+        </w:tc>
+        <w:tc>
+          <w:tcPr>
+            <w:tcW w:type="dxa" w:w="750"/>
+            <w:tcBorders>
+              <w:top w:val="single" w:color="BFB5A5" w:sz="4"/>
+              <w:left w:val="single" w:color="BFB5A5" w:sz="4"/>
+              <w:bottom w:val="single" w:color="BFB5A5" w:sz="4"/>
+              <w:right w:val="single" w:color="BFB5A5" w:sz="4"/>
+            </w:tcBorders>
+            <w:tcMar>
+              <w:top w:type="dxa" w:w="50"/>
+              <w:left w:type="dxa" w:w="90"/>
+              <w:bottom w:type="dxa" w:w="50"/>
+              <w:right w:type="dxa" w:w="90"/>
+            </w:tcMar>
+          </w:tcPr>
+          <w:p>
+            <w:pPr>
+              <w:spacing w:after="0" w:before="0"/>
+              <w:jc w:val="center"/>
+            </w:pPr>
+            <w:r>
+              <w:rPr>
+                <w:rFonts w:ascii="Calibri" w:cs="Calibri" w:eastAsia="Calibri" w:hAnsi="Calibri"/>
+                <w:b w:val="false"/>
+                <w:bCs w:val="false"/>
+                <w:color w:val="2B2318"/>
+                <w:sz w:val="19"/>
+                <w:szCs w:val="19"/>
+              </w:rPr>
+              <w:t xml:space="preserve">☐</w:t>
+            </w:r>
+          </w:p>
+        </w:tc>
+        <w:tc>
+          <w:tcPr>
+            <w:tcW w:type="dxa" w:w="750"/>
+            <w:tcBorders>
+              <w:top w:val="single" w:color="BFB5A5" w:sz="4"/>
+              <w:left w:val="single" w:color="BFB5A5" w:sz="4"/>
+              <w:bottom w:val="single" w:color="BFB5A5" w:sz="4"/>
+              <w:right w:val="single" w:color="BFB5A5" w:sz="4"/>
+            </w:tcBorders>
+            <w:tcMar>
+              <w:top w:type="dxa" w:w="50"/>
+              <w:left w:type="dxa" w:w="90"/>
+              <w:bottom w:type="dxa" w:w="50"/>
+              <w:right w:type="dxa" w:w="90"/>
+            </w:tcMar>
+          </w:tcPr>
+          <w:p>
+            <w:pPr>
+              <w:spacing w:after="0" w:before="0"/>
+              <w:jc w:val="center"/>
+            </w:pPr>
+            <w:r>
+              <w:rPr>
+                <w:rFonts w:ascii="Calibri" w:cs="Calibri" w:eastAsia="Calibri" w:hAnsi="Calibri"/>
+                <w:b w:val="false"/>
+                <w:bCs w:val="false"/>
+                <w:color w:val="2B2318"/>
+                <w:sz w:val="19"/>
+                <w:szCs w:val="19"/>
+              </w:rPr>
+              <w:t xml:space="preserve">☐</w:t>
+            </w:r>
+          </w:p>
+        </w:tc>
+        <w:tc>
+          <w:tcPr>
+            <w:tcW w:type="dxa" w:w="4406"/>
+            <w:tcBorders>
+              <w:top w:val="single" w:color="BFB5A5" w:sz="4"/>
+              <w:left w:val="single" w:color="BFB5A5" w:sz="4"/>
+              <w:bottom w:val="single" w:color="BFB5A5" w:sz="4"/>
+              <w:right w:val="single" w:color="BFB5A5" w:sz="4"/>
+            </w:tcBorders>
+            <w:tcMar>
+              <w:top w:type="dxa" w:w="50"/>
+              <w:left w:type="dxa" w:w="90"/>
+              <w:bottom w:type="dxa" w:w="50"/>
+              <w:right w:type="dxa" w:w="90"/>
+            </w:tcMar>
+          </w:tcPr>
+          <w:p>
+            <w:pPr>
+              <w:spacing w:after="0" w:before="0"/>
+              <w:jc w:val="center"/>
+            </w:pPr>
+            <w:r>
+              <w:rPr>
+                <w:rFonts w:ascii="Calibri" w:cs="Calibri" w:eastAsia="Calibri" w:hAnsi="Calibri"/>
+                <w:b w:val="false"/>
+                <w:bCs w:val="false"/>
+                <w:color w:val="2B2318"/>
+                <w:sz w:val="19"/>
+                <w:szCs w:val="19"/>
+              </w:rPr>
+              <w:t xml:space="preserve"/>
+            </w:r>
+          </w:p>
+        </w:tc>
+      </w:tr>
+      <w:tr>
+        <w:trPr>
+          <w:cantSplit/>
+          <w:trHeight w:val="840" w:hRule="atLeast"/>
+        </w:trPr>
+        <w:tc>
+          <w:tcPr>
+            <w:tcW w:type="dxa" w:w="4300"/>
+            <w:tcBorders>
+              <w:top w:val="single" w:color="BFB5A5" w:sz="4"/>
+              <w:left w:val="single" w:color="BFB5A5" w:sz="4"/>
+              <w:bottom w:val="single" w:color="BFB5A5" w:sz="4"/>
+              <w:right w:val="single" w:color="BFB5A5" w:sz="4"/>
+            </w:tcBorders>
+            <w:tcMar>
+              <w:top w:type="dxa" w:w="50"/>
+              <w:left w:type="dxa" w:w="90"/>
+              <w:bottom w:type="dxa" w:w="50"/>
+              <w:right w:type="dxa" w:w="90"/>
+            </w:tcMar>
+          </w:tcPr>
+          <w:p>
+            <w:pPr>
+              <w:spacing w:after="0" w:before="0"/>
+            </w:pPr>
+            <w:r>
+              <w:rPr>
+                <w:rFonts w:ascii="Calibri" w:cs="Calibri" w:eastAsia="Calibri" w:hAnsi="Calibri"/>
+                <w:b w:val="false"/>
+                <w:bCs w:val="false"/>
+                <w:color w:val="2B2318"/>
+                <w:sz w:val="19"/>
+                <w:szCs w:val="19"/>
+              </w:rPr>
+              <w:t xml:space="preserve">d) Solon verteilte das Land der Großgrundbesitzer an die Bauern.</w:t>
+            </w:r>
+          </w:p>
+        </w:tc>
+        <w:tc>
+          <w:tcPr>
+            <w:tcW w:type="dxa" w:w="750"/>
+            <w:tcBorders>
+              <w:top w:val="single" w:color="BFB5A5" w:sz="4"/>
+              <w:left w:val="single" w:color="BFB5A5" w:sz="4"/>
+              <w:bottom w:val="single" w:color="BFB5A5" w:sz="4"/>
+              <w:right w:val="single" w:color="BFB5A5" w:sz="4"/>
+            </w:tcBorders>
+            <w:tcMar>
+              <w:top w:type="dxa" w:w="50"/>
+              <w:left w:type="dxa" w:w="90"/>
+              <w:bottom w:type="dxa" w:w="50"/>
+              <w:right w:type="dxa" w:w="90"/>
+            </w:tcMar>
+          </w:tcPr>
+          <w:p>
+            <w:pPr>
+              <w:spacing w:after="0" w:before="0"/>
+              <w:jc w:val="center"/>
+            </w:pPr>
+            <w:r>
+              <w:rPr>
+                <w:rFonts w:ascii="Calibri" w:cs="Calibri" w:eastAsia="Calibri" w:hAnsi="Calibri"/>
+                <w:b w:val="false"/>
+                <w:bCs w:val="false"/>
+                <w:color w:val="2B2318"/>
+                <w:sz w:val="19"/>
+                <w:szCs w:val="19"/>
+              </w:rPr>
+              <w:t xml:space="preserve">☐</w:t>
+            </w:r>
+          </w:p>
+        </w:tc>
+        <w:tc>
+          <w:tcPr>
+            <w:tcW w:type="dxa" w:w="750"/>
+            <w:tcBorders>
+              <w:top w:val="single" w:color="BFB5A5" w:sz="4"/>
+              <w:left w:val="single" w:color="BFB5A5" w:sz="4"/>
+              <w:bottom w:val="single" w:color="BFB5A5" w:sz="4"/>
+              <w:right w:val="single" w:color="BFB5A5" w:sz="4"/>
+            </w:tcBorders>
+            <w:tcMar>
+              <w:top w:type="dxa" w:w="50"/>
+              <w:left w:type="dxa" w:w="90"/>
+              <w:bottom w:type="dxa" w:w="50"/>
+              <w:right w:type="dxa" w:w="90"/>
+            </w:tcMar>
+          </w:tcPr>
+          <w:p>
+            <w:pPr>
+              <w:spacing w:after="0" w:before="0"/>
+              <w:jc w:val="center"/>
+            </w:pPr>
+            <w:r>
+              <w:rPr>
+                <w:rFonts w:ascii="Calibri" w:cs="Calibri" w:eastAsia="Calibri" w:hAnsi="Calibri"/>
+                <w:b w:val="false"/>
+                <w:bCs w:val="false"/>
+                <w:color w:val="2B2318"/>
+                <w:sz w:val="19"/>
+                <w:szCs w:val="19"/>
+              </w:rPr>
+              <w:t xml:space="preserve">☐</w:t>
+            </w:r>
+          </w:p>
+        </w:tc>
+        <w:tc>
+          <w:tcPr>
+            <w:tcW w:type="dxa" w:w="4406"/>
+            <w:tcBorders>
+              <w:top w:val="single" w:color="BFB5A5" w:sz="4"/>
+              <w:left w:val="single" w:color="BFB5A5" w:sz="4"/>
+              <w:bottom w:val="single" w:color="BFB5A5" w:sz="4"/>
+              <w:right w:val="single" w:color="BFB5A5" w:sz="4"/>
+            </w:tcBorders>
+            <w:tcMar>
+              <w:top w:type="dxa" w:w="50"/>
+              <w:left w:type="dxa" w:w="90"/>
+              <w:bottom w:type="dxa" w:w="50"/>
+              <w:right w:type="dxa" w:w="90"/>
+            </w:tcMar>
+          </w:tcPr>
+          <w:p>
+            <w:pPr>
+              <w:spacing w:after="0" w:before="0"/>
+              <w:jc w:val="center"/>
+            </w:pPr>
+            <w:r>
+              <w:rPr>
+                <w:rFonts w:ascii="Calibri" w:cs="Calibri" w:eastAsia="Calibri" w:hAnsi="Calibri"/>
+                <w:b w:val="false"/>
+                <w:bCs w:val="false"/>
+                <w:color w:val="2B2318"/>
+                <w:sz w:val="19"/>
+                <w:szCs w:val="19"/>
+              </w:rPr>
+              <w:t xml:space="preserve"/>
+            </w:r>
+          </w:p>
+        </w:tc>
+      </w:tr>
+      <w:tr>
+        <w:trPr>
+          <w:cantSplit/>
+          <w:trHeight w:val="840" w:hRule="atLeast"/>
+        </w:trPr>
+        <w:tc>
+          <w:tcPr>
+            <w:tcW w:type="dxa" w:w="4300"/>
+            <w:tcBorders>
+              <w:top w:val="single" w:color="BFB5A5" w:sz="4"/>
+              <w:left w:val="single" w:color="BFB5A5" w:sz="4"/>
+              <w:bottom w:val="single" w:color="BFB5A5" w:sz="4"/>
+              <w:right w:val="single" w:color="BFB5A5" w:sz="4"/>
+            </w:tcBorders>
+            <w:tcMar>
+              <w:top w:type="dxa" w:w="50"/>
+              <w:left w:type="dxa" w:w="90"/>
+              <w:bottom w:type="dxa" w:w="50"/>
+              <w:right w:type="dxa" w:w="90"/>
+            </w:tcMar>
+          </w:tcPr>
+          <w:p>
+            <w:pPr>
+              <w:spacing w:after="0" w:before="0"/>
+            </w:pPr>
+            <w:r>
+              <w:rPr>
+                <w:rFonts w:ascii="Calibri" w:cs="Calibri" w:eastAsia="Calibri" w:hAnsi="Calibri"/>
+                <w:b w:val="false"/>
+                <w:bCs w:val="false"/>
+                <w:color w:val="2B2318"/>
+                <w:sz w:val="19"/>
+                <w:szCs w:val="19"/>
+              </w:rPr>
+              <w:t xml:space="preserve">e) Peisistratos wurde von der Volksversammlung zum Herrscher gewählt.</w:t>
+            </w:r>
+          </w:p>
+        </w:tc>
+        <w:tc>
+          <w:tcPr>
+            <w:tcW w:type="dxa" w:w="750"/>
+            <w:tcBorders>
+              <w:top w:val="single" w:color="BFB5A5" w:sz="4"/>
+              <w:left w:val="single" w:color="BFB5A5" w:sz="4"/>
+              <w:bottom w:val="single" w:color="BFB5A5" w:sz="4"/>
+              <w:right w:val="single" w:color="BFB5A5" w:sz="4"/>
+            </w:tcBorders>
+            <w:tcMar>
+              <w:top w:type="dxa" w:w="50"/>
+              <w:left w:type="dxa" w:w="90"/>
+              <w:bottom w:type="dxa" w:w="50"/>
+              <w:right w:type="dxa" w:w="90"/>
+            </w:tcMar>
+          </w:tcPr>
+          <w:p>
+            <w:pPr>
+              <w:spacing w:after="0" w:before="0"/>
+              <w:jc w:val="center"/>
+            </w:pPr>
+            <w:r>
+              <w:rPr>
+                <w:rFonts w:ascii="Calibri" w:cs="Calibri" w:eastAsia="Calibri" w:hAnsi="Calibri"/>
+                <w:b w:val="false"/>
+                <w:bCs w:val="false"/>
+                <w:color w:val="2B2318"/>
+                <w:sz w:val="19"/>
+                <w:szCs w:val="19"/>
+              </w:rPr>
+              <w:t xml:space="preserve">☐</w:t>
+            </w:r>
+          </w:p>
+        </w:tc>
+        <w:tc>
+          <w:tcPr>
+            <w:tcW w:type="dxa" w:w="750"/>
+            <w:tcBorders>
+              <w:top w:val="single" w:color="BFB5A5" w:sz="4"/>
+              <w:left w:val="single" w:color="BFB5A5" w:sz="4"/>
+              <w:bottom w:val="single" w:color="BFB5A5" w:sz="4"/>
+              <w:right w:val="single" w:color="BFB5A5" w:sz="4"/>
+            </w:tcBorders>
+            <w:tcMar>
+              <w:top w:type="dxa" w:w="50"/>
+              <w:left w:type="dxa" w:w="90"/>
+              <w:bottom w:type="dxa" w:w="50"/>
+              <w:right w:type="dxa" w:w="90"/>
+            </w:tcMar>
+          </w:tcPr>
+          <w:p>
+            <w:pPr>
+              <w:spacing w:after="0" w:before="0"/>
+              <w:jc w:val="center"/>
+            </w:pPr>
+            <w:r>
+              <w:rPr>
+                <w:rFonts w:ascii="Calibri" w:cs="Calibri" w:eastAsia="Calibri" w:hAnsi="Calibri"/>
+                <w:b w:val="false"/>
+                <w:bCs w:val="false"/>
+                <w:color w:val="2B2318"/>
+                <w:sz w:val="19"/>
+                <w:szCs w:val="19"/>
+              </w:rPr>
+              <w:t xml:space="preserve">☐</w:t>
+            </w:r>
+          </w:p>
+        </w:tc>
+        <w:tc>
+          <w:tcPr>
+            <w:tcW w:type="dxa" w:w="4406"/>
+            <w:tcBorders>
+              <w:top w:val="single" w:color="BFB5A5" w:sz="4"/>
+              <w:left w:val="single" w:color="BFB5A5" w:sz="4"/>
+              <w:bottom w:val="single" w:color="BFB5A5" w:sz="4"/>
+              <w:right w:val="single" w:color="BFB5A5" w:sz="4"/>
+            </w:tcBorders>
+            <w:tcMar>
+              <w:top w:type="dxa" w:w="50"/>
+              <w:left w:type="dxa" w:w="90"/>
+              <w:bottom w:type="dxa" w:w="50"/>
+              <w:right w:type="dxa" w:w="90"/>
+            </w:tcMar>
+          </w:tcPr>
+          <w:p>
+            <w:pPr>
+              <w:spacing w:after="0" w:before="0"/>
+              <w:jc w:val="center"/>
+            </w:pPr>
+            <w:r>
+              <w:rPr>
+                <w:rFonts w:ascii="Calibri" w:cs="Calibri" w:eastAsia="Calibri" w:hAnsi="Calibri"/>
+                <w:b w:val="false"/>
+                <w:bCs w:val="false"/>
+                <w:color w:val="2B2318"/>
+                <w:sz w:val="19"/>
+                <w:szCs w:val="19"/>
+              </w:rPr>
+              <w:t xml:space="preserve"/>
+            </w:r>
+          </w:p>
+        </w:tc>
+      </w:tr>
+      <w:tr>
+        <w:trPr>
+          <w:cantSplit/>
+          <w:trHeight w:val="840" w:hRule="atLeast"/>
+        </w:trPr>
+        <w:tc>
+          <w:tcPr>
+            <w:tcW w:type="dxa" w:w="4300"/>
+            <w:tcBorders>
+              <w:top w:val="single" w:color="BFB5A5" w:sz="4"/>
+              <w:left w:val="single" w:color="BFB5A5" w:sz="4"/>
+              <w:bottom w:val="single" w:color="BFB5A5" w:sz="4"/>
+              <w:right w:val="single" w:color="BFB5A5" w:sz="4"/>
+            </w:tcBorders>
+            <w:tcMar>
+              <w:top w:type="dxa" w:w="50"/>
+              <w:left w:type="dxa" w:w="90"/>
+              <w:bottom w:type="dxa" w:w="50"/>
+              <w:right w:type="dxa" w:w="90"/>
+            </w:tcMar>
+          </w:tcPr>
+          <w:p>
+            <w:pPr>
+              <w:spacing w:after="0" w:before="0"/>
+            </w:pPr>
+            <w:r>
+              <w:rPr>
+                <w:rFonts w:ascii="Calibri" w:cs="Calibri" w:eastAsia="Calibri" w:hAnsi="Calibri"/>
+                <w:b w:val="false"/>
+                <w:bCs w:val="false"/>
+                <w:color w:val="2B2318"/>
+                <w:sz w:val="19"/>
+                <w:szCs w:val="19"/>
+              </w:rPr>
+              <w:t xml:space="preserve">f) Peisistratos ließ Solons Verfassung bestehen, besetzte die Ämter aber mit seinen Anhängern.</w:t>
+            </w:r>
+          </w:p>
+        </w:tc>
+        <w:tc>
+          <w:tcPr>
+            <w:tcW w:type="dxa" w:w="750"/>
+            <w:tcBorders>
+              <w:top w:val="single" w:color="BFB5A5" w:sz="4"/>
+              <w:left w:val="single" w:color="BFB5A5" w:sz="4"/>
+              <w:bottom w:val="single" w:color="BFB5A5" w:sz="4"/>
+              <w:right w:val="single" w:color="BFB5A5" w:sz="4"/>
+            </w:tcBorders>
+            <w:tcMar>
+              <w:top w:type="dxa" w:w="50"/>
+              <w:left w:type="dxa" w:w="90"/>
+              <w:bottom w:type="dxa" w:w="50"/>
+              <w:right w:type="dxa" w:w="90"/>
+            </w:tcMar>
+          </w:tcPr>
+          <w:p>
+            <w:pPr>
+              <w:spacing w:after="0" w:before="0"/>
+              <w:jc w:val="center"/>
+            </w:pPr>
+            <w:r>
+              <w:rPr>
+                <w:rFonts w:ascii="Calibri" w:cs="Calibri" w:eastAsia="Calibri" w:hAnsi="Calibri"/>
+                <w:b w:val="false"/>
+                <w:bCs w:val="false"/>
+                <w:color w:val="2B2318"/>
+                <w:sz w:val="19"/>
+                <w:szCs w:val="19"/>
+              </w:rPr>
+              <w:t xml:space="preserve">☐</w:t>
+            </w:r>
+          </w:p>
+        </w:tc>
+        <w:tc>
+          <w:tcPr>
+            <w:tcW w:type="dxa" w:w="750"/>
+            <w:tcBorders>
+              <w:top w:val="single" w:color="BFB5A5" w:sz="4"/>
+              <w:left w:val="single" w:color="BFB5A5" w:sz="4"/>
+              <w:bottom w:val="single" w:color="BFB5A5" w:sz="4"/>
+              <w:right w:val="single" w:color="BFB5A5" w:sz="4"/>
+            </w:tcBorders>
+            <w:tcMar>
+              <w:top w:type="dxa" w:w="50"/>
+              <w:left w:type="dxa" w:w="90"/>
+              <w:bottom w:type="dxa" w:w="50"/>
+              <w:right w:type="dxa" w:w="90"/>
+            </w:tcMar>
+          </w:tcPr>
+          <w:p>
+            <w:pPr>
+              <w:spacing w:after="0" w:before="0"/>
+              <w:jc w:val="center"/>
+            </w:pPr>
+            <w:r>
+              <w:rPr>
+                <w:rFonts w:ascii="Calibri" w:cs="Calibri" w:eastAsia="Calibri" w:hAnsi="Calibri"/>
+                <w:b w:val="false"/>
+                <w:bCs w:val="false"/>
+                <w:color w:val="2B2318"/>
+                <w:sz w:val="19"/>
+                <w:szCs w:val="19"/>
+              </w:rPr>
+              <w:t xml:space="preserve">☐</w:t>
+            </w:r>
+          </w:p>
+        </w:tc>
+        <w:tc>
+          <w:tcPr>
+            <w:tcW w:type="dxa" w:w="4406"/>
+            <w:tcBorders>
+              <w:top w:val="single" w:color="BFB5A5" w:sz="4"/>
+              <w:left w:val="single" w:color="BFB5A5" w:sz="4"/>
+              <w:bottom w:val="single" w:color="BFB5A5" w:sz="4"/>
+              <w:right w:val="single" w:color="BFB5A5" w:sz="4"/>
+            </w:tcBorders>
+            <w:tcMar>
+              <w:top w:type="dxa" w:w="50"/>
+              <w:left w:type="dxa" w:w="90"/>
+              <w:bottom w:type="dxa" w:w="50"/>
+              <w:right w:type="dxa" w:w="90"/>
+            </w:tcMar>
+          </w:tcPr>
+          <w:p>
+            <w:pPr>
+              <w:spacing w:after="0" w:before="0"/>
+              <w:jc w:val="center"/>
+            </w:pPr>
+            <w:r>
+              <w:rPr>
+                <w:rFonts w:ascii="Calibri" w:cs="Calibri" w:eastAsia="Calibri" w:hAnsi="Calibri"/>
+                <w:b w:val="false"/>
+                <w:bCs w:val="false"/>
+                <w:color w:val="2B2318"/>
+                <w:sz w:val="19"/>
+                <w:szCs w:val="19"/>
+              </w:rPr>
+              <w:t xml:space="preserve"/>
+            </w:r>
+          </w:p>
+        </w:tc>
+      </w:tr>
+    </w:tbl>
+    <w:p>
+      <w:pPr>
+        <w:keepNext/>
+        <w:tabs>
+          <w:tab w:val="right" w:pos="10206"/>
+        </w:tabs>
+        <w:spacing w:after="60" w:before="160"/>
+      </w:pPr>
+      <w:r>
+        <w:rPr>
+          <w:rFonts w:ascii="Cambria" w:cs="Cambria" w:eastAsia="Cambria" w:hAnsi="Cambria"/>
+          <w:b/>
+          <w:bCs/>
+          <w:color w:val="AD4426"/>
+          <w:sz w:val="23"/>
+          <w:szCs w:val="23"/>
+        </w:rPr>
+        <w:t xml:space="preserve">3  </w:t>
+      </w:r>
+      <w:r>
+        <w:rPr>
+          <w:rFonts w:ascii="Cambria" w:cs="Cambria" w:eastAsia="Cambria" w:hAnsi="Cambria"/>
+          <w:b/>
+          <w:bCs/>
+          <w:color w:val="2B2318"/>
+          <w:sz w:val="22"/>
+          <w:szCs w:val="22"/>
+        </w:rPr>
+        <w:t xml:space="preserve">Sachurteil oder Werturteil?</w:t>
+      </w:r>
+      <w:r>
+        <w:rPr>
+          <w:rFonts w:ascii="Calibri" w:cs="Calibri" w:eastAsia="Calibri" w:hAnsi="Calibri"/>
+          <w:b/>
+          <w:bCs/>
+          <w:color w:val="5A5044"/>
+          <w:sz w:val="19"/>
+          <w:szCs w:val="19"/>
+        </w:rPr>
+        <w:t xml:space="preserve">	6 P.</w:t>
+      </w:r>
+    </w:p>
+    <w:p>
+      <w:pPr>
+        <w:spacing w:after="40" w:before="0"/>
+      </w:pPr>
+      <w:r>
+        <w:rPr>
+          <w:rFonts w:ascii="Calibri" w:cs="Calibri" w:eastAsia="Calibri" w:hAnsi="Calibri"/>
+          <w:color w:val="2B2318"/>
+          <w:sz w:val="20"/>
+          <w:szCs w:val="20"/>
+        </w:rPr>
+        <w:t xml:space="preserve">a) Ordne zu: S = Sachurteil, W = Werturteil. (je 1 P.)</w:t>
+      </w:r>
+    </w:p>
+    <w:tbl>
+      <w:tblPr>
+        <w:tblW w:type="dxa" w:w="10206"/>
+        <w:tblBorders>
+          <w:top w:val="single" w:color="auto" w:sz="4"/>
+          <w:left w:val="single" w:color="auto" w:sz="4"/>
+          <w:bottom w:val="single" w:color="auto" w:sz="4"/>
+          <w:right w:val="single" w:color="auto" w:sz="4"/>
+          <w:insideH w:val="single" w:color="auto" w:sz="4"/>
+          <w:insideV w:val="single" w:color="auto" w:sz="4"/>
+        </w:tblBorders>
+      </w:tblPr>
+      <w:tblGrid>
+        <w:gridCol w:w="8906"/>
+        <w:gridCol w:w="1300"/>
+      </w:tblGrid>
+      <w:tr>
+        <w:trPr>
+          <w:cantSplit/>
+        </w:trPr>
+        <w:tc>
+          <w:tcPr>
+            <w:tcW w:type="dxa" w:w="8906"/>
+            <w:tcBorders>
+              <w:top w:val="single" w:color="BFB5A5" w:sz="4"/>
+              <w:left w:val="single" w:color="BFB5A5" w:sz="4"/>
+              <w:bottom w:val="single" w:color="BFB5A5" w:sz="4"/>
+              <w:right w:val="single" w:color="BFB5A5" w:sz="4"/>
+            </w:tcBorders>
+            <w:shd w:fill="F4ECDE" w:color="auto" w:val="clear"/>
+            <w:tcMar>
+              <w:top w:type="dxa" w:w="50"/>
+              <w:left w:type="dxa" w:w="90"/>
+              <w:bottom w:type="dxa" w:w="50"/>
+              <w:right w:type="dxa" w:w="90"/>
+            </w:tcMar>
+          </w:tcPr>
+          <w:p>
+            <w:pPr>
+              <w:spacing w:after="0" w:before="0"/>
+            </w:pPr>
+            <w:r>
+              <w:rPr>
+                <w:rFonts w:ascii="Calibri" w:cs="Calibri" w:eastAsia="Calibri" w:hAnsi="Calibri"/>
+                <w:b/>
+                <w:bCs/>
+                <w:color w:val="2B2318"/>
+                <w:sz w:val="19"/>
+                <w:szCs w:val="19"/>
+              </w:rPr>
+              <w:t xml:space="preserve">Aussage</w:t>
+            </w:r>
+          </w:p>
+        </w:tc>
+        <w:tc>
+          <w:tcPr>
+            <w:tcW w:type="dxa" w:w="1300"/>
+            <w:tcBorders>
+              <w:top w:val="single" w:color="BFB5A5" w:sz="4"/>
+              <w:left w:val="single" w:color="BFB5A5" w:sz="4"/>
+              <w:bottom w:val="single" w:color="BFB5A5" w:sz="4"/>
+              <w:right w:val="single" w:color="BFB5A5" w:sz="4"/>
+            </w:tcBorders>
+            <w:shd w:fill="F4ECDE" w:color="auto" w:val="clear"/>
+            <w:tcMar>
+              <w:top w:type="dxa" w:w="50"/>
+              <w:left w:type="dxa" w:w="90"/>
+              <w:bottom w:type="dxa" w:w="50"/>
+              <w:right w:type="dxa" w:w="90"/>
+            </w:tcMar>
+          </w:tcPr>
+          <w:p>
+            <w:pPr>
+              <w:spacing w:after="0" w:before="0"/>
+              <w:jc w:val="center"/>
+            </w:pPr>
+            <w:r>
+              <w:rPr>
+                <w:rFonts w:ascii="Calibri" w:cs="Calibri" w:eastAsia="Calibri" w:hAnsi="Calibri"/>
+                <w:b/>
+                <w:bCs/>
+                <w:color w:val="2B2318"/>
+                <w:sz w:val="19"/>
+                <w:szCs w:val="19"/>
+              </w:rPr>
+              <w:t xml:space="preserve">S / W</w:t>
             </w:r>
           </w:p>
         </w:tc>
@@ -456,7 +1449,7 @@
         </w:trPr>
         <w:tc>
           <w:tcPr>
-            <w:tcW w:type="dxa" w:w="6700"/>
+            <w:tcW w:type="dxa" w:w="8906"/>
             <w:tcBorders>
               <w:top w:val="single" w:color="BFB5A5" w:sz="4"/>
               <w:left w:val="single" w:color="BFB5A5" w:sz="4"/>
@@ -483,81 +1476,13 @@
                 <w:sz w:val="19"/>
                 <w:szCs w:val="19"/>
               </w:rPr>
-              <w:t xml:space="preserve">a) Drakon schrieb das Recht in Athen erstmals auf.</w:t>
-            </w:r>
-          </w:p>
-        </w:tc>
-        <w:tc>
-          <w:tcPr>
-            <w:tcW w:type="dxa" w:w="900"/>
-            <w:tcBorders>
-              <w:top w:val="single" w:color="BFB5A5" w:sz="4"/>
-              <w:left w:val="single" w:color="BFB5A5" w:sz="4"/>
-              <w:bottom w:val="single" w:color="BFB5A5" w:sz="4"/>
-              <w:right w:val="single" w:color="BFB5A5" w:sz="4"/>
-            </w:tcBorders>
-            <w:tcMar>
-              <w:top w:type="dxa" w:w="50"/>
-              <w:left w:type="dxa" w:w="90"/>
-              <w:bottom w:type="dxa" w:w="50"/>
-              <w:right w:type="dxa" w:w="90"/>
-            </w:tcMar>
-          </w:tcPr>
-          <w:p>
-            <w:pPr>
-              <w:spacing w:after="0" w:before="0"/>
-              <w:jc w:val="center"/>
-            </w:pPr>
-            <w:r>
-              <w:rPr>
-                <w:rFonts w:ascii="Calibri" w:cs="Calibri" w:eastAsia="Calibri" w:hAnsi="Calibri"/>
-                <w:b w:val="false"/>
-                <w:bCs w:val="false"/>
-                <w:color w:val="2B2318"/>
-                <w:sz w:val="19"/>
-                <w:szCs w:val="19"/>
-              </w:rPr>
-              <w:t xml:space="preserve">☐</w:t>
-            </w:r>
-          </w:p>
-        </w:tc>
-        <w:tc>
-          <w:tcPr>
-            <w:tcW w:type="dxa" w:w="900"/>
-            <w:tcBorders>
-              <w:top w:val="single" w:color="BFB5A5" w:sz="4"/>
-              <w:left w:val="single" w:color="BFB5A5" w:sz="4"/>
-              <w:bottom w:val="single" w:color="BFB5A5" w:sz="4"/>
-              <w:right w:val="single" w:color="BFB5A5" w:sz="4"/>
-            </w:tcBorders>
-            <w:tcMar>
-              <w:top w:type="dxa" w:w="50"/>
-              <w:left w:type="dxa" w:w="90"/>
-              <w:bottom w:type="dxa" w:w="50"/>
-              <w:right w:type="dxa" w:w="90"/>
-            </w:tcMar>
-          </w:tcPr>
-          <w:p>
-            <w:pPr>
-              <w:spacing w:after="0" w:before="0"/>
-              <w:jc w:val="center"/>
-            </w:pPr>
-            <w:r>
-              <w:rPr>
-                <w:rFonts w:ascii="Calibri" w:cs="Calibri" w:eastAsia="Calibri" w:hAnsi="Calibri"/>
-                <w:b w:val="false"/>
-                <w:bCs w:val="false"/>
-                <w:color w:val="2B2318"/>
-                <w:sz w:val="19"/>
-                <w:szCs w:val="19"/>
-              </w:rPr>
-              <w:t xml:space="preserve">☐</w:t>
-            </w:r>
-          </w:p>
-        </w:tc>
-        <w:tc>
-          <w:tcPr>
-            <w:tcW w:type="dxa" w:w="1706"/>
+              <w:t xml:space="preserve">1) Gemessen am Schutz der Schwachen halte ich Drakons Gesetze für ungerecht, weil schon kleine Vergehen sehr hart bestraft wurden.</w:t>
+            </w:r>
+          </w:p>
+        </w:tc>
+        <w:tc>
+          <w:tcPr>
+            <w:tcW w:type="dxa" w:w="1300"/>
             <w:tcBorders>
               <w:top w:val="single" w:color="BFB5A5" w:sz="4"/>
               <w:left w:val="single" w:color="BFB5A5" w:sz="4"/>
@@ -596,7 +1521,7 @@
         </w:trPr>
         <w:tc>
           <w:tcPr>
-            <w:tcW w:type="dxa" w:w="6700"/>
+            <w:tcW w:type="dxa" w:w="8906"/>
             <w:tcBorders>
               <w:top w:val="single" w:color="BFB5A5" w:sz="4"/>
               <w:left w:val="single" w:color="BFB5A5" w:sz="4"/>
@@ -623,81 +1548,13 @@
                 <w:sz w:val="19"/>
                 <w:szCs w:val="19"/>
               </w:rPr>
-              <w:t xml:space="preserve">b) Drakon schaffte die Schuldknechtschaft ab.</w:t>
-            </w:r>
-          </w:p>
-        </w:tc>
-        <w:tc>
-          <w:tcPr>
-            <w:tcW w:type="dxa" w:w="900"/>
-            <w:tcBorders>
-              <w:top w:val="single" w:color="BFB5A5" w:sz="4"/>
-              <w:left w:val="single" w:color="BFB5A5" w:sz="4"/>
-              <w:bottom w:val="single" w:color="BFB5A5" w:sz="4"/>
-              <w:right w:val="single" w:color="BFB5A5" w:sz="4"/>
-            </w:tcBorders>
-            <w:tcMar>
-              <w:top w:type="dxa" w:w="50"/>
-              <w:left w:type="dxa" w:w="90"/>
-              <w:bottom w:type="dxa" w:w="50"/>
-              <w:right w:type="dxa" w:w="90"/>
-            </w:tcMar>
-          </w:tcPr>
-          <w:p>
-            <w:pPr>
-              <w:spacing w:after="0" w:before="0"/>
-              <w:jc w:val="center"/>
-            </w:pPr>
-            <w:r>
-              <w:rPr>
-                <w:rFonts w:ascii="Calibri" w:cs="Calibri" w:eastAsia="Calibri" w:hAnsi="Calibri"/>
-                <w:b w:val="false"/>
-                <w:bCs w:val="false"/>
-                <w:color w:val="2B2318"/>
-                <w:sz w:val="19"/>
-                <w:szCs w:val="19"/>
-              </w:rPr>
-              <w:t xml:space="preserve">☐</w:t>
-            </w:r>
-          </w:p>
-        </w:tc>
-        <w:tc>
-          <w:tcPr>
-            <w:tcW w:type="dxa" w:w="900"/>
-            <w:tcBorders>
-              <w:top w:val="single" w:color="BFB5A5" w:sz="4"/>
-              <w:left w:val="single" w:color="BFB5A5" w:sz="4"/>
-              <w:bottom w:val="single" w:color="BFB5A5" w:sz="4"/>
-              <w:right w:val="single" w:color="BFB5A5" w:sz="4"/>
-            </w:tcBorders>
-            <w:tcMar>
-              <w:top w:type="dxa" w:w="50"/>
-              <w:left w:type="dxa" w:w="90"/>
-              <w:bottom w:type="dxa" w:w="50"/>
-              <w:right w:type="dxa" w:w="90"/>
-            </w:tcMar>
-          </w:tcPr>
-          <w:p>
-            <w:pPr>
-              <w:spacing w:after="0" w:before="0"/>
-              <w:jc w:val="center"/>
-            </w:pPr>
-            <w:r>
-              <w:rPr>
-                <w:rFonts w:ascii="Calibri" w:cs="Calibri" w:eastAsia="Calibri" w:hAnsi="Calibri"/>
-                <w:b w:val="false"/>
-                <w:bCs w:val="false"/>
-                <w:color w:val="2B2318"/>
-                <w:sz w:val="19"/>
-                <w:szCs w:val="19"/>
-              </w:rPr>
-              <w:t xml:space="preserve">☐</w:t>
-            </w:r>
-          </w:p>
-        </w:tc>
-        <w:tc>
-          <w:tcPr>
-            <w:tcW w:type="dxa" w:w="1706"/>
+              <w:t xml:space="preserve">2) Aus Sicht der damaligen Zeit waren Drakons Gesetze ein Fortschritt, weil nun jeder wissen konnte, welche Strafe drohte.</w:t>
+            </w:r>
+          </w:p>
+        </w:tc>
+        <w:tc>
+          <w:tcPr>
+            <w:tcW w:type="dxa" w:w="1300"/>
             <w:tcBorders>
               <w:top w:val="single" w:color="BFB5A5" w:sz="4"/>
               <w:left w:val="single" w:color="BFB5A5" w:sz="4"/>
@@ -736,7 +1593,7 @@
         </w:trPr>
         <w:tc>
           <w:tcPr>
-            <w:tcW w:type="dxa" w:w="6700"/>
+            <w:tcW w:type="dxa" w:w="8906"/>
             <w:tcBorders>
               <w:top w:val="single" w:color="BFB5A5" w:sz="4"/>
               <w:left w:val="single" w:color="BFB5A5" w:sz="4"/>
@@ -763,81 +1620,13 @@
                 <w:sz w:val="19"/>
                 <w:szCs w:val="19"/>
               </w:rPr>
-              <w:t xml:space="preserve">c) Solon strich die Schulden und kaufte versklavte Bürger zurück.</w:t>
-            </w:r>
-          </w:p>
-        </w:tc>
-        <w:tc>
-          <w:tcPr>
-            <w:tcW w:type="dxa" w:w="900"/>
-            <w:tcBorders>
-              <w:top w:val="single" w:color="BFB5A5" w:sz="4"/>
-              <w:left w:val="single" w:color="BFB5A5" w:sz="4"/>
-              <w:bottom w:val="single" w:color="BFB5A5" w:sz="4"/>
-              <w:right w:val="single" w:color="BFB5A5" w:sz="4"/>
-            </w:tcBorders>
-            <w:tcMar>
-              <w:top w:type="dxa" w:w="50"/>
-              <w:left w:type="dxa" w:w="90"/>
-              <w:bottom w:type="dxa" w:w="50"/>
-              <w:right w:type="dxa" w:w="90"/>
-            </w:tcMar>
-          </w:tcPr>
-          <w:p>
-            <w:pPr>
-              <w:spacing w:after="0" w:before="0"/>
-              <w:jc w:val="center"/>
-            </w:pPr>
-            <w:r>
-              <w:rPr>
-                <w:rFonts w:ascii="Calibri" w:cs="Calibri" w:eastAsia="Calibri" w:hAnsi="Calibri"/>
-                <w:b w:val="false"/>
-                <w:bCs w:val="false"/>
-                <w:color w:val="2B2318"/>
-                <w:sz w:val="19"/>
-                <w:szCs w:val="19"/>
-              </w:rPr>
-              <w:t xml:space="preserve">☐</w:t>
-            </w:r>
-          </w:p>
-        </w:tc>
-        <w:tc>
-          <w:tcPr>
-            <w:tcW w:type="dxa" w:w="900"/>
-            <w:tcBorders>
-              <w:top w:val="single" w:color="BFB5A5" w:sz="4"/>
-              <w:left w:val="single" w:color="BFB5A5" w:sz="4"/>
-              <w:bottom w:val="single" w:color="BFB5A5" w:sz="4"/>
-              <w:right w:val="single" w:color="BFB5A5" w:sz="4"/>
-            </w:tcBorders>
-            <w:tcMar>
-              <w:top w:type="dxa" w:w="50"/>
-              <w:left w:type="dxa" w:w="90"/>
-              <w:bottom w:type="dxa" w:w="50"/>
-              <w:right w:type="dxa" w:w="90"/>
-            </w:tcMar>
-          </w:tcPr>
-          <w:p>
-            <w:pPr>
-              <w:spacing w:after="0" w:before="0"/>
-              <w:jc w:val="center"/>
-            </w:pPr>
-            <w:r>
-              <w:rPr>
-                <w:rFonts w:ascii="Calibri" w:cs="Calibri" w:eastAsia="Calibri" w:hAnsi="Calibri"/>
-                <w:b w:val="false"/>
-                <w:bCs w:val="false"/>
-                <w:color w:val="2B2318"/>
-                <w:sz w:val="19"/>
-                <w:szCs w:val="19"/>
-              </w:rPr>
-              <w:t xml:space="preserve">☐</w:t>
-            </w:r>
-          </w:p>
-        </w:tc>
-        <w:tc>
-          <w:tcPr>
-            <w:tcW w:type="dxa" w:w="1706"/>
+              <w:t xml:space="preserve">3) Aus Sicht der damaligen Zeit schwächte Peisistratos den Adel, weil er die Ämter mit seinen eigenen Anhängern besetzte.</w:t>
+            </w:r>
+          </w:p>
+        </w:tc>
+        <w:tc>
+          <w:tcPr>
+            <w:tcW w:type="dxa" w:w="1300"/>
             <w:tcBorders>
               <w:top w:val="single" w:color="BFB5A5" w:sz="4"/>
               <w:left w:val="single" w:color="BFB5A5" w:sz="4"/>
@@ -876,7 +1665,7 @@
         </w:trPr>
         <w:tc>
           <w:tcPr>
-            <w:tcW w:type="dxa" w:w="6700"/>
+            <w:tcW w:type="dxa" w:w="8906"/>
             <w:tcBorders>
               <w:top w:val="single" w:color="BFB5A5" w:sz="4"/>
               <w:left w:val="single" w:color="BFB5A5" w:sz="4"/>
@@ -903,361 +1692,13 @@
                 <w:sz w:val="19"/>
                 <w:szCs w:val="19"/>
               </w:rPr>
-              <w:t xml:space="preserve">d) Solon verteilte das Land der Großgrundbesitzer an die Bauern.</w:t>
-            </w:r>
-          </w:p>
-        </w:tc>
-        <w:tc>
-          <w:tcPr>
-            <w:tcW w:type="dxa" w:w="900"/>
-            <w:tcBorders>
-              <w:top w:val="single" w:color="BFB5A5" w:sz="4"/>
-              <w:left w:val="single" w:color="BFB5A5" w:sz="4"/>
-              <w:bottom w:val="single" w:color="BFB5A5" w:sz="4"/>
-              <w:right w:val="single" w:color="BFB5A5" w:sz="4"/>
-            </w:tcBorders>
-            <w:tcMar>
-              <w:top w:type="dxa" w:w="50"/>
-              <w:left w:type="dxa" w:w="90"/>
-              <w:bottom w:type="dxa" w:w="50"/>
-              <w:right w:type="dxa" w:w="90"/>
-            </w:tcMar>
-          </w:tcPr>
-          <w:p>
-            <w:pPr>
-              <w:spacing w:after="0" w:before="0"/>
-              <w:jc w:val="center"/>
-            </w:pPr>
-            <w:r>
-              <w:rPr>
-                <w:rFonts w:ascii="Calibri" w:cs="Calibri" w:eastAsia="Calibri" w:hAnsi="Calibri"/>
-                <w:b w:val="false"/>
-                <w:bCs w:val="false"/>
-                <w:color w:val="2B2318"/>
-                <w:sz w:val="19"/>
-                <w:szCs w:val="19"/>
-              </w:rPr>
-              <w:t xml:space="preserve">☐</w:t>
-            </w:r>
-          </w:p>
-        </w:tc>
-        <w:tc>
-          <w:tcPr>
-            <w:tcW w:type="dxa" w:w="900"/>
-            <w:tcBorders>
-              <w:top w:val="single" w:color="BFB5A5" w:sz="4"/>
-              <w:left w:val="single" w:color="BFB5A5" w:sz="4"/>
-              <w:bottom w:val="single" w:color="BFB5A5" w:sz="4"/>
-              <w:right w:val="single" w:color="BFB5A5" w:sz="4"/>
-            </w:tcBorders>
-            <w:tcMar>
-              <w:top w:type="dxa" w:w="50"/>
-              <w:left w:type="dxa" w:w="90"/>
-              <w:bottom w:type="dxa" w:w="50"/>
-              <w:right w:type="dxa" w:w="90"/>
-            </w:tcMar>
-          </w:tcPr>
-          <w:p>
-            <w:pPr>
-              <w:spacing w:after="0" w:before="0"/>
-              <w:jc w:val="center"/>
-            </w:pPr>
-            <w:r>
-              <w:rPr>
-                <w:rFonts w:ascii="Calibri" w:cs="Calibri" w:eastAsia="Calibri" w:hAnsi="Calibri"/>
-                <w:b w:val="false"/>
-                <w:bCs w:val="false"/>
-                <w:color w:val="2B2318"/>
-                <w:sz w:val="19"/>
-                <w:szCs w:val="19"/>
-              </w:rPr>
-              <w:t xml:space="preserve">☐</w:t>
-            </w:r>
-          </w:p>
-        </w:tc>
-        <w:tc>
-          <w:tcPr>
-            <w:tcW w:type="dxa" w:w="1706"/>
-            <w:tcBorders>
-              <w:top w:val="single" w:color="BFB5A5" w:sz="4"/>
-              <w:left w:val="single" w:color="BFB5A5" w:sz="4"/>
-              <w:bottom w:val="single" w:color="BFB5A5" w:sz="4"/>
-              <w:right w:val="single" w:color="BFB5A5" w:sz="4"/>
-            </w:tcBorders>
-            <w:tcMar>
-              <w:top w:type="dxa" w:w="50"/>
-              <w:left w:type="dxa" w:w="90"/>
-              <w:bottom w:type="dxa" w:w="50"/>
-              <w:right w:type="dxa" w:w="90"/>
-            </w:tcMar>
-          </w:tcPr>
-          <w:p>
-            <w:pPr>
-              <w:spacing w:after="0" w:before="0"/>
-              <w:jc w:val="center"/>
-            </w:pPr>
-            <w:r>
-              <w:rPr>
-                <w:rFonts w:ascii="Calibri" w:cs="Calibri" w:eastAsia="Calibri" w:hAnsi="Calibri"/>
-                <w:b w:val="false"/>
-                <w:bCs w:val="false"/>
-                <w:color w:val="2B2318"/>
-                <w:sz w:val="19"/>
-                <w:szCs w:val="19"/>
-              </w:rPr>
-              <w:t xml:space="preserve"/>
-            </w:r>
-          </w:p>
-        </w:tc>
-      </w:tr>
-      <w:tr>
-        <w:trPr>
-          <w:cantSplit/>
-        </w:trPr>
-        <w:tc>
-          <w:tcPr>
-            <w:tcW w:type="dxa" w:w="6700"/>
-            <w:tcBorders>
-              <w:top w:val="single" w:color="BFB5A5" w:sz="4"/>
-              <w:left w:val="single" w:color="BFB5A5" w:sz="4"/>
-              <w:bottom w:val="single" w:color="BFB5A5" w:sz="4"/>
-              <w:right w:val="single" w:color="BFB5A5" w:sz="4"/>
-            </w:tcBorders>
-            <w:tcMar>
-              <w:top w:type="dxa" w:w="50"/>
-              <w:left w:type="dxa" w:w="90"/>
-              <w:bottom w:type="dxa" w:w="50"/>
-              <w:right w:type="dxa" w:w="90"/>
-            </w:tcMar>
-          </w:tcPr>
-          <w:p>
-            <w:pPr>
-              <w:spacing w:after="0" w:before="0"/>
-            </w:pPr>
-            <w:r>
-              <w:rPr>
-                <w:rFonts w:ascii="Calibri" w:cs="Calibri" w:eastAsia="Calibri" w:hAnsi="Calibri"/>
-                <w:b w:val="false"/>
-                <w:bCs w:val="false"/>
-                <w:color w:val="2B2318"/>
-                <w:sz w:val="19"/>
-                <w:szCs w:val="19"/>
-              </w:rPr>
-              <w:t xml:space="preserve">e) Peisistratos wurde von der Volksversammlung zum Herrscher gewählt.</w:t>
-            </w:r>
-          </w:p>
-        </w:tc>
-        <w:tc>
-          <w:tcPr>
-            <w:tcW w:type="dxa" w:w="900"/>
-            <w:tcBorders>
-              <w:top w:val="single" w:color="BFB5A5" w:sz="4"/>
-              <w:left w:val="single" w:color="BFB5A5" w:sz="4"/>
-              <w:bottom w:val="single" w:color="BFB5A5" w:sz="4"/>
-              <w:right w:val="single" w:color="BFB5A5" w:sz="4"/>
-            </w:tcBorders>
-            <w:tcMar>
-              <w:top w:type="dxa" w:w="50"/>
-              <w:left w:type="dxa" w:w="90"/>
-              <w:bottom w:type="dxa" w:w="50"/>
-              <w:right w:type="dxa" w:w="90"/>
-            </w:tcMar>
-          </w:tcPr>
-          <w:p>
-            <w:pPr>
-              <w:spacing w:after="0" w:before="0"/>
-              <w:jc w:val="center"/>
-            </w:pPr>
-            <w:r>
-              <w:rPr>
-                <w:rFonts w:ascii="Calibri" w:cs="Calibri" w:eastAsia="Calibri" w:hAnsi="Calibri"/>
-                <w:b w:val="false"/>
-                <w:bCs w:val="false"/>
-                <w:color w:val="2B2318"/>
-                <w:sz w:val="19"/>
-                <w:szCs w:val="19"/>
-              </w:rPr>
-              <w:t xml:space="preserve">☐</w:t>
-            </w:r>
-          </w:p>
-        </w:tc>
-        <w:tc>
-          <w:tcPr>
-            <w:tcW w:type="dxa" w:w="900"/>
-            <w:tcBorders>
-              <w:top w:val="single" w:color="BFB5A5" w:sz="4"/>
-              <w:left w:val="single" w:color="BFB5A5" w:sz="4"/>
-              <w:bottom w:val="single" w:color="BFB5A5" w:sz="4"/>
-              <w:right w:val="single" w:color="BFB5A5" w:sz="4"/>
-            </w:tcBorders>
-            <w:tcMar>
-              <w:top w:type="dxa" w:w="50"/>
-              <w:left w:type="dxa" w:w="90"/>
-              <w:bottom w:type="dxa" w:w="50"/>
-              <w:right w:type="dxa" w:w="90"/>
-            </w:tcMar>
-          </w:tcPr>
-          <w:p>
-            <w:pPr>
-              <w:spacing w:after="0" w:before="0"/>
-              <w:jc w:val="center"/>
-            </w:pPr>
-            <w:r>
-              <w:rPr>
-                <w:rFonts w:ascii="Calibri" w:cs="Calibri" w:eastAsia="Calibri" w:hAnsi="Calibri"/>
-                <w:b w:val="false"/>
-                <w:bCs w:val="false"/>
-                <w:color w:val="2B2318"/>
-                <w:sz w:val="19"/>
-                <w:szCs w:val="19"/>
-              </w:rPr>
-              <w:t xml:space="preserve">☐</w:t>
-            </w:r>
-          </w:p>
-        </w:tc>
-        <w:tc>
-          <w:tcPr>
-            <w:tcW w:type="dxa" w:w="1706"/>
-            <w:tcBorders>
-              <w:top w:val="single" w:color="BFB5A5" w:sz="4"/>
-              <w:left w:val="single" w:color="BFB5A5" w:sz="4"/>
-              <w:bottom w:val="single" w:color="BFB5A5" w:sz="4"/>
-              <w:right w:val="single" w:color="BFB5A5" w:sz="4"/>
-            </w:tcBorders>
-            <w:tcMar>
-              <w:top w:type="dxa" w:w="50"/>
-              <w:left w:type="dxa" w:w="90"/>
-              <w:bottom w:type="dxa" w:w="50"/>
-              <w:right w:type="dxa" w:w="90"/>
-            </w:tcMar>
-          </w:tcPr>
-          <w:p>
-            <w:pPr>
-              <w:spacing w:after="0" w:before="0"/>
-              <w:jc w:val="center"/>
-            </w:pPr>
-            <w:r>
-              <w:rPr>
-                <w:rFonts w:ascii="Calibri" w:cs="Calibri" w:eastAsia="Calibri" w:hAnsi="Calibri"/>
-                <w:b w:val="false"/>
-                <w:bCs w:val="false"/>
-                <w:color w:val="2B2318"/>
-                <w:sz w:val="19"/>
-                <w:szCs w:val="19"/>
-              </w:rPr>
-              <w:t xml:space="preserve"/>
-            </w:r>
-          </w:p>
-        </w:tc>
-      </w:tr>
-      <w:tr>
-        <w:trPr>
-          <w:cantSplit/>
-        </w:trPr>
-        <w:tc>
-          <w:tcPr>
-            <w:tcW w:type="dxa" w:w="6700"/>
-            <w:tcBorders>
-              <w:top w:val="single" w:color="BFB5A5" w:sz="4"/>
-              <w:left w:val="single" w:color="BFB5A5" w:sz="4"/>
-              <w:bottom w:val="single" w:color="BFB5A5" w:sz="4"/>
-              <w:right w:val="single" w:color="BFB5A5" w:sz="4"/>
-            </w:tcBorders>
-            <w:tcMar>
-              <w:top w:type="dxa" w:w="50"/>
-              <w:left w:type="dxa" w:w="90"/>
-              <w:bottom w:type="dxa" w:w="50"/>
-              <w:right w:type="dxa" w:w="90"/>
-            </w:tcMar>
-          </w:tcPr>
-          <w:p>
-            <w:pPr>
-              <w:spacing w:after="0" w:before="0"/>
-            </w:pPr>
-            <w:r>
-              <w:rPr>
-                <w:rFonts w:ascii="Calibri" w:cs="Calibri" w:eastAsia="Calibri" w:hAnsi="Calibri"/>
-                <w:b w:val="false"/>
-                <w:bCs w:val="false"/>
-                <w:color w:val="2B2318"/>
-                <w:sz w:val="19"/>
-                <w:szCs w:val="19"/>
-              </w:rPr>
-              <w:t xml:space="preserve">f) Peisistratos ließ Solons Verfassung bestehen, besetzte die Ämter aber mit seinen Anhängern.</w:t>
-            </w:r>
-          </w:p>
-        </w:tc>
-        <w:tc>
-          <w:tcPr>
-            <w:tcW w:type="dxa" w:w="900"/>
-            <w:tcBorders>
-              <w:top w:val="single" w:color="BFB5A5" w:sz="4"/>
-              <w:left w:val="single" w:color="BFB5A5" w:sz="4"/>
-              <w:bottom w:val="single" w:color="BFB5A5" w:sz="4"/>
-              <w:right w:val="single" w:color="BFB5A5" w:sz="4"/>
-            </w:tcBorders>
-            <w:tcMar>
-              <w:top w:type="dxa" w:w="50"/>
-              <w:left w:type="dxa" w:w="90"/>
-              <w:bottom w:type="dxa" w:w="50"/>
-              <w:right w:type="dxa" w:w="90"/>
-            </w:tcMar>
-          </w:tcPr>
-          <w:p>
-            <w:pPr>
-              <w:spacing w:after="0" w:before="0"/>
-              <w:jc w:val="center"/>
-            </w:pPr>
-            <w:r>
-              <w:rPr>
-                <w:rFonts w:ascii="Calibri" w:cs="Calibri" w:eastAsia="Calibri" w:hAnsi="Calibri"/>
-                <w:b w:val="false"/>
-                <w:bCs w:val="false"/>
-                <w:color w:val="2B2318"/>
-                <w:sz w:val="19"/>
-                <w:szCs w:val="19"/>
-              </w:rPr>
-              <w:t xml:space="preserve">☐</w:t>
-            </w:r>
-          </w:p>
-        </w:tc>
-        <w:tc>
-          <w:tcPr>
-            <w:tcW w:type="dxa" w:w="900"/>
-            <w:tcBorders>
-              <w:top w:val="single" w:color="BFB5A5" w:sz="4"/>
-              <w:left w:val="single" w:color="BFB5A5" w:sz="4"/>
-              <w:bottom w:val="single" w:color="BFB5A5" w:sz="4"/>
-              <w:right w:val="single" w:color="BFB5A5" w:sz="4"/>
-            </w:tcBorders>
-            <w:tcMar>
-              <w:top w:type="dxa" w:w="50"/>
-              <w:left w:type="dxa" w:w="90"/>
-              <w:bottom w:type="dxa" w:w="50"/>
-              <w:right w:type="dxa" w:w="90"/>
-            </w:tcMar>
-          </w:tcPr>
-          <w:p>
-            <w:pPr>
-              <w:spacing w:after="0" w:before="0"/>
-              <w:jc w:val="center"/>
-            </w:pPr>
-            <w:r>
-              <w:rPr>
-                <w:rFonts w:ascii="Calibri" w:cs="Calibri" w:eastAsia="Calibri" w:hAnsi="Calibri"/>
-                <w:b w:val="false"/>
-                <w:bCs w:val="false"/>
-                <w:color w:val="2B2318"/>
-                <w:sz w:val="19"/>
-                <w:szCs w:val="19"/>
-              </w:rPr>
-              <w:t xml:space="preserve">☐</w:t>
-            </w:r>
-          </w:p>
-        </w:tc>
-        <w:tc>
-          <w:tcPr>
-            <w:tcW w:type="dxa" w:w="1706"/>
+              <w:t xml:space="preserve">4) Die Tyrannis des Peisistratos war ein Fehler.</w:t>
+            </w:r>
+          </w:p>
+        </w:tc>
+        <w:tc>
+          <w:tcPr>
+            <w:tcW w:type="dxa" w:w="1300"/>
             <w:tcBorders>
               <w:top w:val="single" w:color="BFB5A5" w:sz="4"/>
               <w:left w:val="single" w:color="BFB5A5" w:sz="4"/>
@@ -1293,18 +1734,16 @@
     </w:tbl>
     <w:p>
       <w:pPr>
-        <w:spacing w:after="40" w:before="60"/>
+        <w:spacing w:after="40" w:before="80"/>
       </w:pPr>
       <w:r>
         <w:rPr>
           <w:rFonts w:ascii="Calibri" w:cs="Calibri" w:eastAsia="Calibri" w:hAnsi="Calibri"/>
-          <w:b/>
-          <w:bCs/>
           <w:color w:val="2B2318"/>
-          <w:sz w:val="19"/>
-          <w:szCs w:val="19"/>
-        </w:rPr>
-        <w:t xml:space="preserve">Berichtigungen:</w:t>
+          <w:sz w:val="20"/>
+          <w:szCs w:val="20"/>
+        </w:rPr>
+        <w:t xml:space="preserve">b) Aussage 4 ist ein schwaches Werturteil. Verbessere es: Nenne einen Maßstab und begründe. (2 P.)</w:t>
       </w:r>
     </w:p>
     <w:tbl>
@@ -1356,23 +1795,6 @@
           <w:p/>
         </w:tc>
       </w:tr>
-      <w:tr>
-        <w:trPr>
-          <w:trHeight w:val="400" w:hRule="exact"/>
-        </w:trPr>
-        <w:tc>
-          <w:tcPr>
-            <w:tcW w:type="dxa" w:w="10206"/>
-            <w:tcBorders>
-              <w:top w:val="none" w:color="FFFFFF" w:sz="0"/>
-              <w:left w:val="none" w:color="FFFFFF" w:sz="0"/>
-              <w:bottom w:val="single" w:color="BFB5A5" w:sz="4"/>
-              <w:right w:val="none" w:color="FFFFFF" w:sz="0"/>
-            </w:tcBorders>
-          </w:tcPr>
-          <w:p/>
-        </w:tc>
-      </w:tr>
     </w:tbl>
     <w:p>
       <w:pPr>
@@ -1391,7 +1813,7 @@
           <w:sz w:val="23"/>
           <w:szCs w:val="23"/>
         </w:rPr>
-        <w:t xml:space="preserve">3  </w:t>
+        <w:t xml:space="preserve">4  </w:t>
       </w:r>
       <w:r>
         <w:rPr>
@@ -1418,6 +1840,7 @@
     </w:p>
     <w:p>
       <w:pPr>
+        <w:keepNext/>
         <w:spacing w:after="40" w:before="0"/>
       </w:pPr>
       <w:r>
@@ -1434,6 +1857,7 @@
     </w:p>
     <w:p>
       <w:pPr>
+        <w:keepNext/>
         <w:spacing w:after="40" w:before="0"/>
       </w:pPr>
       <w:r>
@@ -1448,6 +1872,7 @@
     </w:p>
     <w:p>
       <w:pPr>
+        <w:keepNext/>
         <w:spacing w:after="40" w:before="0"/>
       </w:pPr>
       <w:r>
@@ -1462,6 +1887,7 @@
     </w:p>
     <w:p>
       <w:pPr>
+        <w:keepNext/>
         <w:spacing w:after="40" w:before="0"/>
       </w:pPr>
       <w:r>
@@ -1520,505 +1946,6 @@
         </w:drawing>
       </w:r>
     </w:p>
-    <w:p>
-      <w:pPr>
-        <w:keepNext/>
-        <w:tabs>
-          <w:tab w:val="right" w:pos="10206"/>
-        </w:tabs>
-        <w:spacing w:after="60" w:before="160"/>
-      </w:pPr>
-      <w:r>
-        <w:rPr>
-          <w:rFonts w:ascii="Cambria" w:cs="Cambria" w:eastAsia="Cambria" w:hAnsi="Cambria"/>
-          <w:b/>
-          <w:bCs/>
-          <w:color w:val="AD4426"/>
-          <w:sz w:val="23"/>
-          <w:szCs w:val="23"/>
-        </w:rPr>
-        <w:t xml:space="preserve">4  </w:t>
-      </w:r>
-      <w:r>
-        <w:rPr>
-          <w:rFonts w:ascii="Cambria" w:cs="Cambria" w:eastAsia="Cambria" w:hAnsi="Cambria"/>
-          <w:b/>
-          <w:bCs/>
-          <w:color w:val="2B2318"/>
-          <w:sz w:val="22"/>
-          <w:szCs w:val="22"/>
-        </w:rPr>
-        <w:t xml:space="preserve">Beschreibung, Sachurteil oder Werturteil?</w:t>
-      </w:r>
-      <w:r>
-        <w:rPr>
-          <w:rFonts w:ascii="Calibri" w:cs="Calibri" w:eastAsia="Calibri" w:hAnsi="Calibri"/>
-          <w:b/>
-          <w:bCs/>
-          <w:color w:val="5A5044"/>
-          <w:sz w:val="19"/>
-          <w:szCs w:val="19"/>
-        </w:rPr>
-        <w:t xml:space="preserve">	6 P.</w:t>
-      </w:r>
-    </w:p>
-    <w:p>
-      <w:pPr>
-        <w:spacing w:after="40" w:before="0"/>
-      </w:pPr>
-      <w:r>
-        <w:rPr>
-          <w:rFonts w:ascii="Calibri" w:cs="Calibri" w:eastAsia="Calibri" w:hAnsi="Calibri"/>
-          <w:color w:val="2B2318"/>
-          <w:sz w:val="20"/>
-          <w:szCs w:val="20"/>
-        </w:rPr>
-        <w:t xml:space="preserve">a) Ordne zu: B = Beschreibung, S = Sachurteil, W = Werturteil. (je 1 P.)</w:t>
-      </w:r>
-    </w:p>
-    <w:tbl>
-      <w:tblPr>
-        <w:tblW w:type="dxa" w:w="10206"/>
-        <w:tblBorders>
-          <w:top w:val="single" w:color="auto" w:sz="4"/>
-          <w:left w:val="single" w:color="auto" w:sz="4"/>
-          <w:bottom w:val="single" w:color="auto" w:sz="4"/>
-          <w:right w:val="single" w:color="auto" w:sz="4"/>
-          <w:insideH w:val="single" w:color="auto" w:sz="4"/>
-          <w:insideV w:val="single" w:color="auto" w:sz="4"/>
-        </w:tblBorders>
-      </w:tblPr>
-      <w:tblGrid>
-        <w:gridCol w:w="8906"/>
-        <w:gridCol w:w="1300"/>
-      </w:tblGrid>
-      <w:tr>
-        <w:trPr>
-          <w:cantSplit/>
-        </w:trPr>
-        <w:tc>
-          <w:tcPr>
-            <w:tcW w:type="dxa" w:w="8906"/>
-            <w:tcBorders>
-              <w:top w:val="single" w:color="BFB5A5" w:sz="4"/>
-              <w:left w:val="single" w:color="BFB5A5" w:sz="4"/>
-              <w:bottom w:val="single" w:color="BFB5A5" w:sz="4"/>
-              <w:right w:val="single" w:color="BFB5A5" w:sz="4"/>
-            </w:tcBorders>
-            <w:shd w:fill="F4ECDE" w:color="auto" w:val="clear"/>
-            <w:tcMar>
-              <w:top w:type="dxa" w:w="50"/>
-              <w:left w:type="dxa" w:w="90"/>
-              <w:bottom w:type="dxa" w:w="50"/>
-              <w:right w:type="dxa" w:w="90"/>
-            </w:tcMar>
-          </w:tcPr>
-          <w:p>
-            <w:pPr>
-              <w:spacing w:after="0" w:before="0"/>
-            </w:pPr>
-            <w:r>
-              <w:rPr>
-                <w:rFonts w:ascii="Calibri" w:cs="Calibri" w:eastAsia="Calibri" w:hAnsi="Calibri"/>
-                <w:b/>
-                <w:bCs/>
-                <w:color w:val="2B2318"/>
-                <w:sz w:val="19"/>
-                <w:szCs w:val="19"/>
-              </w:rPr>
-              <w:t xml:space="preserve">Aussage</w:t>
-            </w:r>
-          </w:p>
-        </w:tc>
-        <w:tc>
-          <w:tcPr>
-            <w:tcW w:type="dxa" w:w="1300"/>
-            <w:tcBorders>
-              <w:top w:val="single" w:color="BFB5A5" w:sz="4"/>
-              <w:left w:val="single" w:color="BFB5A5" w:sz="4"/>
-              <w:bottom w:val="single" w:color="BFB5A5" w:sz="4"/>
-              <w:right w:val="single" w:color="BFB5A5" w:sz="4"/>
-            </w:tcBorders>
-            <w:shd w:fill="F4ECDE" w:color="auto" w:val="clear"/>
-            <w:tcMar>
-              <w:top w:type="dxa" w:w="50"/>
-              <w:left w:type="dxa" w:w="90"/>
-              <w:bottom w:type="dxa" w:w="50"/>
-              <w:right w:type="dxa" w:w="90"/>
-            </w:tcMar>
-          </w:tcPr>
-          <w:p>
-            <w:pPr>
-              <w:spacing w:after="0" w:before="0"/>
-              <w:jc w:val="center"/>
-            </w:pPr>
-            <w:r>
-              <w:rPr>
-                <w:rFonts w:ascii="Calibri" w:cs="Calibri" w:eastAsia="Calibri" w:hAnsi="Calibri"/>
-                <w:b/>
-                <w:bCs/>
-                <w:color w:val="2B2318"/>
-                <w:sz w:val="19"/>
-                <w:szCs w:val="19"/>
-              </w:rPr>
-              <w:t xml:space="preserve">B / S / W</w:t>
-            </w:r>
-          </w:p>
-        </w:tc>
-      </w:tr>
-      <w:tr>
-        <w:trPr>
-          <w:cantSplit/>
-        </w:trPr>
-        <w:tc>
-          <w:tcPr>
-            <w:tcW w:type="dxa" w:w="8906"/>
-            <w:tcBorders>
-              <w:top w:val="single" w:color="BFB5A5" w:sz="4"/>
-              <w:left w:val="single" w:color="BFB5A5" w:sz="4"/>
-              <w:bottom w:val="single" w:color="BFB5A5" w:sz="4"/>
-              <w:right w:val="single" w:color="BFB5A5" w:sz="4"/>
-            </w:tcBorders>
-            <w:tcMar>
-              <w:top w:type="dxa" w:w="50"/>
-              <w:left w:type="dxa" w:w="90"/>
-              <w:bottom w:type="dxa" w:w="50"/>
-              <w:right w:type="dxa" w:w="90"/>
-            </w:tcMar>
-          </w:tcPr>
-          <w:p>
-            <w:pPr>
-              <w:spacing w:after="0" w:before="0"/>
-            </w:pPr>
-            <w:r>
-              <w:rPr>
-                <w:rFonts w:ascii="Calibri" w:cs="Calibri" w:eastAsia="Calibri" w:hAnsi="Calibri"/>
-                <w:b w:val="false"/>
-                <w:bCs w:val="false"/>
-                <w:color w:val="2B2318"/>
-                <w:sz w:val="19"/>
-                <w:szCs w:val="19"/>
-              </w:rPr>
-              <w:t xml:space="preserve">1) 594 v. Chr. erhielt Solon als Archon besondere Vollmachten.</w:t>
-            </w:r>
-          </w:p>
-        </w:tc>
-        <w:tc>
-          <w:tcPr>
-            <w:tcW w:type="dxa" w:w="1300"/>
-            <w:tcBorders>
-              <w:top w:val="single" w:color="BFB5A5" w:sz="4"/>
-              <w:left w:val="single" w:color="BFB5A5" w:sz="4"/>
-              <w:bottom w:val="single" w:color="BFB5A5" w:sz="4"/>
-              <w:right w:val="single" w:color="BFB5A5" w:sz="4"/>
-            </w:tcBorders>
-            <w:tcMar>
-              <w:top w:type="dxa" w:w="50"/>
-              <w:left w:type="dxa" w:w="90"/>
-              <w:bottom w:type="dxa" w:w="50"/>
-              <w:right w:type="dxa" w:w="90"/>
-            </w:tcMar>
-          </w:tcPr>
-          <w:p>
-            <w:pPr>
-              <w:spacing w:after="0" w:before="0"/>
-              <w:jc w:val="center"/>
-            </w:pPr>
-            <w:r>
-              <w:rPr>
-                <w:rFonts w:ascii="Calibri" w:cs="Calibri" w:eastAsia="Calibri" w:hAnsi="Calibri"/>
-                <w:b w:val="false"/>
-                <w:bCs w:val="false"/>
-                <w:color w:val="2B2318"/>
-                <w:sz w:val="19"/>
-                <w:szCs w:val="19"/>
-              </w:rPr>
-              <w:t xml:space="preserve"/>
-            </w:r>
-          </w:p>
-        </w:tc>
-      </w:tr>
-      <w:tr>
-        <w:trPr>
-          <w:cantSplit/>
-        </w:trPr>
-        <w:tc>
-          <w:tcPr>
-            <w:tcW w:type="dxa" w:w="8906"/>
-            <w:tcBorders>
-              <w:top w:val="single" w:color="BFB5A5" w:sz="4"/>
-              <w:left w:val="single" w:color="BFB5A5" w:sz="4"/>
-              <w:bottom w:val="single" w:color="BFB5A5" w:sz="4"/>
-              <w:right w:val="single" w:color="BFB5A5" w:sz="4"/>
-            </w:tcBorders>
-            <w:tcMar>
-              <w:top w:type="dxa" w:w="50"/>
-              <w:left w:type="dxa" w:w="90"/>
-              <w:bottom w:type="dxa" w:w="50"/>
-              <w:right w:type="dxa" w:w="90"/>
-            </w:tcMar>
-          </w:tcPr>
-          <w:p>
-            <w:pPr>
-              <w:spacing w:after="0" w:before="0"/>
-            </w:pPr>
-            <w:r>
-              <w:rPr>
-                <w:rFonts w:ascii="Calibri" w:cs="Calibri" w:eastAsia="Calibri" w:hAnsi="Calibri"/>
-                <w:b w:val="false"/>
-                <w:bCs w:val="false"/>
-                <w:color w:val="2B2318"/>
-                <w:sz w:val="19"/>
-                <w:szCs w:val="19"/>
-              </w:rPr>
-              <w:t xml:space="preserve">2) Aus Sicht der damaligen Zeit verhinderte Solon einen Bürgerkrieg, weil er weder die Armen versklaven noch die Reichen enteignen ließ.</w:t>
-            </w:r>
-          </w:p>
-        </w:tc>
-        <w:tc>
-          <w:tcPr>
-            <w:tcW w:type="dxa" w:w="1300"/>
-            <w:tcBorders>
-              <w:top w:val="single" w:color="BFB5A5" w:sz="4"/>
-              <w:left w:val="single" w:color="BFB5A5" w:sz="4"/>
-              <w:bottom w:val="single" w:color="BFB5A5" w:sz="4"/>
-              <w:right w:val="single" w:color="BFB5A5" w:sz="4"/>
-            </w:tcBorders>
-            <w:tcMar>
-              <w:top w:type="dxa" w:w="50"/>
-              <w:left w:type="dxa" w:w="90"/>
-              <w:bottom w:type="dxa" w:w="50"/>
-              <w:right w:type="dxa" w:w="90"/>
-            </w:tcMar>
-          </w:tcPr>
-          <w:p>
-            <w:pPr>
-              <w:spacing w:after="0" w:before="0"/>
-              <w:jc w:val="center"/>
-            </w:pPr>
-            <w:r>
-              <w:rPr>
-                <w:rFonts w:ascii="Calibri" w:cs="Calibri" w:eastAsia="Calibri" w:hAnsi="Calibri"/>
-                <w:b w:val="false"/>
-                <w:bCs w:val="false"/>
-                <w:color w:val="2B2318"/>
-                <w:sz w:val="19"/>
-                <w:szCs w:val="19"/>
-              </w:rPr>
-              <w:t xml:space="preserve"/>
-            </w:r>
-          </w:p>
-        </w:tc>
-      </w:tr>
-      <w:tr>
-        <w:trPr>
-          <w:cantSplit/>
-        </w:trPr>
-        <w:tc>
-          <w:tcPr>
-            <w:tcW w:type="dxa" w:w="8906"/>
-            <w:tcBorders>
-              <w:top w:val="single" w:color="BFB5A5" w:sz="4"/>
-              <w:left w:val="single" w:color="BFB5A5" w:sz="4"/>
-              <w:bottom w:val="single" w:color="BFB5A5" w:sz="4"/>
-              <w:right w:val="single" w:color="BFB5A5" w:sz="4"/>
-            </w:tcBorders>
-            <w:tcMar>
-              <w:top w:type="dxa" w:w="50"/>
-              <w:left w:type="dxa" w:w="90"/>
-              <w:bottom w:type="dxa" w:w="50"/>
-              <w:right w:type="dxa" w:w="90"/>
-            </w:tcMar>
-          </w:tcPr>
-          <w:p>
-            <w:pPr>
-              <w:spacing w:after="0" w:before="0"/>
-            </w:pPr>
-            <w:r>
-              <w:rPr>
-                <w:rFonts w:ascii="Calibri" w:cs="Calibri" w:eastAsia="Calibri" w:hAnsi="Calibri"/>
-                <w:b w:val="false"/>
-                <w:bCs w:val="false"/>
-                <w:color w:val="2B2318"/>
-                <w:sz w:val="19"/>
-                <w:szCs w:val="19"/>
-              </w:rPr>
-              <w:t xml:space="preserve">3) Gemessen an der Gleichheit aller Menschen halte ich Solons Verfassung für ungerecht, weil Frauen keine Rechte hatten.</w:t>
-            </w:r>
-          </w:p>
-        </w:tc>
-        <w:tc>
-          <w:tcPr>
-            <w:tcW w:type="dxa" w:w="1300"/>
-            <w:tcBorders>
-              <w:top w:val="single" w:color="BFB5A5" w:sz="4"/>
-              <w:left w:val="single" w:color="BFB5A5" w:sz="4"/>
-              <w:bottom w:val="single" w:color="BFB5A5" w:sz="4"/>
-              <w:right w:val="single" w:color="BFB5A5" w:sz="4"/>
-            </w:tcBorders>
-            <w:tcMar>
-              <w:top w:type="dxa" w:w="50"/>
-              <w:left w:type="dxa" w:w="90"/>
-              <w:bottom w:type="dxa" w:w="50"/>
-              <w:right w:type="dxa" w:w="90"/>
-            </w:tcMar>
-          </w:tcPr>
-          <w:p>
-            <w:pPr>
-              <w:spacing w:after="0" w:before="0"/>
-              <w:jc w:val="center"/>
-            </w:pPr>
-            <w:r>
-              <w:rPr>
-                <w:rFonts w:ascii="Calibri" w:cs="Calibri" w:eastAsia="Calibri" w:hAnsi="Calibri"/>
-                <w:b w:val="false"/>
-                <w:bCs w:val="false"/>
-                <w:color w:val="2B2318"/>
-                <w:sz w:val="19"/>
-                <w:szCs w:val="19"/>
-              </w:rPr>
-              <w:t xml:space="preserve"/>
-            </w:r>
-          </w:p>
-        </w:tc>
-      </w:tr>
-      <w:tr>
-        <w:trPr>
-          <w:cantSplit/>
-        </w:trPr>
-        <w:tc>
-          <w:tcPr>
-            <w:tcW w:type="dxa" w:w="8906"/>
-            <w:tcBorders>
-              <w:top w:val="single" w:color="BFB5A5" w:sz="4"/>
-              <w:left w:val="single" w:color="BFB5A5" w:sz="4"/>
-              <w:bottom w:val="single" w:color="BFB5A5" w:sz="4"/>
-              <w:right w:val="single" w:color="BFB5A5" w:sz="4"/>
-            </w:tcBorders>
-            <w:tcMar>
-              <w:top w:type="dxa" w:w="50"/>
-              <w:left w:type="dxa" w:w="90"/>
-              <w:bottom w:type="dxa" w:w="50"/>
-              <w:right w:type="dxa" w:w="90"/>
-            </w:tcMar>
-          </w:tcPr>
-          <w:p>
-            <w:pPr>
-              <w:spacing w:after="0" w:before="0"/>
-            </w:pPr>
-            <w:r>
-              <w:rPr>
-                <w:rFonts w:ascii="Calibri" w:cs="Calibri" w:eastAsia="Calibri" w:hAnsi="Calibri"/>
-                <w:b w:val="false"/>
-                <w:bCs w:val="false"/>
-                <w:color w:val="2B2318"/>
-                <w:sz w:val="19"/>
-                <w:szCs w:val="19"/>
-              </w:rPr>
-              <w:t xml:space="preserve">4) Die Tyrannis des Peisistratos war ein Fehler.</w:t>
-            </w:r>
-          </w:p>
-        </w:tc>
-        <w:tc>
-          <w:tcPr>
-            <w:tcW w:type="dxa" w:w="1300"/>
-            <w:tcBorders>
-              <w:top w:val="single" w:color="BFB5A5" w:sz="4"/>
-              <w:left w:val="single" w:color="BFB5A5" w:sz="4"/>
-              <w:bottom w:val="single" w:color="BFB5A5" w:sz="4"/>
-              <w:right w:val="single" w:color="BFB5A5" w:sz="4"/>
-            </w:tcBorders>
-            <w:tcMar>
-              <w:top w:type="dxa" w:w="50"/>
-              <w:left w:type="dxa" w:w="90"/>
-              <w:bottom w:type="dxa" w:w="50"/>
-              <w:right w:type="dxa" w:w="90"/>
-            </w:tcMar>
-          </w:tcPr>
-          <w:p>
-            <w:pPr>
-              <w:spacing w:after="0" w:before="0"/>
-              <w:jc w:val="center"/>
-            </w:pPr>
-            <w:r>
-              <w:rPr>
-                <w:rFonts w:ascii="Calibri" w:cs="Calibri" w:eastAsia="Calibri" w:hAnsi="Calibri"/>
-                <w:b w:val="false"/>
-                <w:bCs w:val="false"/>
-                <w:color w:val="2B2318"/>
-                <w:sz w:val="19"/>
-                <w:szCs w:val="19"/>
-              </w:rPr>
-              <w:t xml:space="preserve"/>
-            </w:r>
-          </w:p>
-        </w:tc>
-      </w:tr>
-    </w:tbl>
-    <w:p>
-      <w:pPr>
-        <w:spacing w:after="40" w:before="80"/>
-      </w:pPr>
-      <w:r>
-        <w:rPr>
-          <w:rFonts w:ascii="Calibri" w:cs="Calibri" w:eastAsia="Calibri" w:hAnsi="Calibri"/>
-          <w:color w:val="2B2318"/>
-          <w:sz w:val="20"/>
-          <w:szCs w:val="20"/>
-        </w:rPr>
-        <w:t xml:space="preserve">b) Aussage 4 ist ein schwaches Werturteil. Verbessere es: Nenne einen Maßstab und begründe. (2 P.)</w:t>
-      </w:r>
-    </w:p>
-    <w:tbl>
-      <w:tblPr>
-        <w:tblW w:type="dxa" w:w="10206"/>
-        <w:tblBorders>
-          <w:top w:val="single" w:color="auto" w:sz="4"/>
-          <w:left w:val="single" w:color="auto" w:sz="4"/>
-          <w:bottom w:val="single" w:color="auto" w:sz="4"/>
-          <w:right w:val="single" w:color="auto" w:sz="4"/>
-          <w:insideH w:val="single" w:color="auto" w:sz="4"/>
-          <w:insideV w:val="single" w:color="auto" w:sz="4"/>
-        </w:tblBorders>
-      </w:tblPr>
-      <w:tblGrid>
-        <w:gridCol w:w="10206"/>
-      </w:tblGrid>
-      <w:tr>
-        <w:trPr>
-          <w:trHeight w:val="400" w:hRule="exact"/>
-        </w:trPr>
-        <w:tc>
-          <w:tcPr>
-            <w:tcW w:type="dxa" w:w="10206"/>
-            <w:tcBorders>
-              <w:top w:val="none" w:color="FFFFFF" w:sz="0"/>
-              <w:left w:val="none" w:color="FFFFFF" w:sz="0"/>
-              <w:bottom w:val="single" w:color="BFB5A5" w:sz="4"/>
-              <w:right w:val="none" w:color="FFFFFF" w:sz="0"/>
-            </w:tcBorders>
-          </w:tcPr>
-          <w:p/>
-        </w:tc>
-      </w:tr>
-      <w:tr>
-        <w:trPr>
-          <w:trHeight w:val="400" w:hRule="exact"/>
-        </w:trPr>
-        <w:tc>
-          <w:tcPr>
-            <w:tcW w:type="dxa" w:w="10206"/>
-            <w:tcBorders>
-              <w:top w:val="none" w:color="FFFFFF" w:sz="0"/>
-              <w:left w:val="none" w:color="FFFFFF" w:sz="0"/>
-              <w:bottom w:val="single" w:color="BFB5A5" w:sz="4"/>
-              <w:right w:val="none" w:color="FFFFFF" w:sz="0"/>
-            </w:tcBorders>
-          </w:tcPr>
-          <w:p/>
-        </w:tc>
-      </w:tr>
-    </w:tbl>
     <w:p>
       <w:pPr>
         <w:keepNext/>

</xml_diff>

<commit_message>
Geschichte 11: Test um Aussagen zu Herrschaftsformen ergänzt (40 Punkte)
Co-Authored-By: Claude Opus 5.5 <noreply@anthropic.com>
Claude-Session: https://claude.ai/code/session_013iN4Tiarea1J9YUJHZ9iqC
</commit_message>
<xml_diff>
--- a/Geschichte_11/Doppelstunde_Test_Quellenanalyse/Test_Athen_bis_Peisistratos.docx
+++ b/Geschichte_11/Doppelstunde_Test_Quellenanalyse/Test_Athen_bis_Peisistratos.docx
@@ -59,7 +59,7 @@
           <w:sz w:val="18"/>
           <w:szCs w:val="18"/>
         </w:rPr>
-        <w:t xml:space="preserve">Bearbeitungszeit 45 Minuten · 37 Punkte + 1 Zusatzpunkt · Hilfsmittel: keine</w:t>
+        <w:t xml:space="preserve">Bearbeitungszeit 45 Minuten · 40 Punkte + 1 Zusatzpunkt · Hilfsmittel: keine</w:t>
       </w:r>
     </w:p>
     <w:p>
@@ -260,7 +260,7 @@
           <w:sz w:val="22"/>
           <w:szCs w:val="22"/>
         </w:rPr>
-        <w:t xml:space="preserve">Drakon, Solon, Peisistratos: richtig oder falsch?</w:t>
+        <w:t xml:space="preserve">Richtig oder falsch?</w:t>
       </w:r>
       <w:r>
         <w:rPr>
@@ -271,7 +271,7 @@
           <w:sz w:val="19"/>
           <w:szCs w:val="19"/>
         </w:rPr>
-        <w:t xml:space="preserve">	9 P.</w:t>
+        <w:t xml:space="preserve">	12 P.</w:t>
       </w:r>
     </w:p>
     <w:p>
@@ -453,7 +453,7 @@
       <w:tr>
         <w:trPr>
           <w:cantSplit/>
-          <w:trHeight w:val="840" w:hRule="atLeast"/>
+          <w:trHeight w:val="700" w:hRule="atLeast"/>
         </w:trPr>
         <w:tc>
           <w:tcPr>
@@ -594,7 +594,7 @@
       <w:tr>
         <w:trPr>
           <w:cantSplit/>
-          <w:trHeight w:val="840" w:hRule="atLeast"/>
+          <w:trHeight w:val="700" w:hRule="atLeast"/>
         </w:trPr>
         <w:tc>
           <w:tcPr>
@@ -735,7 +735,7 @@
       <w:tr>
         <w:trPr>
           <w:cantSplit/>
-          <w:trHeight w:val="840" w:hRule="atLeast"/>
+          <w:trHeight w:val="700" w:hRule="atLeast"/>
         </w:trPr>
         <w:tc>
           <w:tcPr>
@@ -876,7 +876,7 @@
       <w:tr>
         <w:trPr>
           <w:cantSplit/>
-          <w:trHeight w:val="840" w:hRule="atLeast"/>
+          <w:trHeight w:val="700" w:hRule="atLeast"/>
         </w:trPr>
         <w:tc>
           <w:tcPr>
@@ -1017,7 +1017,7 @@
       <w:tr>
         <w:trPr>
           <w:cantSplit/>
-          <w:trHeight w:val="840" w:hRule="atLeast"/>
+          <w:trHeight w:val="700" w:hRule="atLeast"/>
         </w:trPr>
         <w:tc>
           <w:tcPr>
@@ -1158,7 +1158,7 @@
       <w:tr>
         <w:trPr>
           <w:cantSplit/>
-          <w:trHeight w:val="840" w:hRule="atLeast"/>
+          <w:trHeight w:val="700" w:hRule="atLeast"/>
         </w:trPr>
         <w:tc>
           <w:tcPr>
@@ -1190,6 +1190,288 @@
                 <w:szCs w:val="19"/>
               </w:rPr>
               <w:t xml:space="preserve">f) Peisistratos ließ Solons Verfassung bestehen, besetzte die Ämter aber mit seinen Anhängern.</w:t>
+            </w:r>
+          </w:p>
+        </w:tc>
+        <w:tc>
+          <w:tcPr>
+            <w:tcW w:type="dxa" w:w="750"/>
+            <w:tcBorders>
+              <w:top w:val="single" w:color="BFB5A5" w:sz="4"/>
+              <w:left w:val="single" w:color="BFB5A5" w:sz="4"/>
+              <w:bottom w:val="single" w:color="BFB5A5" w:sz="4"/>
+              <w:right w:val="single" w:color="BFB5A5" w:sz="4"/>
+            </w:tcBorders>
+            <w:tcMar>
+              <w:top w:type="dxa" w:w="50"/>
+              <w:left w:type="dxa" w:w="90"/>
+              <w:bottom w:type="dxa" w:w="50"/>
+              <w:right w:type="dxa" w:w="90"/>
+            </w:tcMar>
+          </w:tcPr>
+          <w:p>
+            <w:pPr>
+              <w:spacing w:after="0" w:before="0"/>
+              <w:jc w:val="center"/>
+            </w:pPr>
+            <w:r>
+              <w:rPr>
+                <w:rFonts w:ascii="Calibri" w:cs="Calibri" w:eastAsia="Calibri" w:hAnsi="Calibri"/>
+                <w:b w:val="false"/>
+                <w:bCs w:val="false"/>
+                <w:color w:val="2B2318"/>
+                <w:sz w:val="19"/>
+                <w:szCs w:val="19"/>
+              </w:rPr>
+              <w:t xml:space="preserve">☐</w:t>
+            </w:r>
+          </w:p>
+        </w:tc>
+        <w:tc>
+          <w:tcPr>
+            <w:tcW w:type="dxa" w:w="750"/>
+            <w:tcBorders>
+              <w:top w:val="single" w:color="BFB5A5" w:sz="4"/>
+              <w:left w:val="single" w:color="BFB5A5" w:sz="4"/>
+              <w:bottom w:val="single" w:color="BFB5A5" w:sz="4"/>
+              <w:right w:val="single" w:color="BFB5A5" w:sz="4"/>
+            </w:tcBorders>
+            <w:tcMar>
+              <w:top w:type="dxa" w:w="50"/>
+              <w:left w:type="dxa" w:w="90"/>
+              <w:bottom w:type="dxa" w:w="50"/>
+              <w:right w:type="dxa" w:w="90"/>
+            </w:tcMar>
+          </w:tcPr>
+          <w:p>
+            <w:pPr>
+              <w:spacing w:after="0" w:before="0"/>
+              <w:jc w:val="center"/>
+            </w:pPr>
+            <w:r>
+              <w:rPr>
+                <w:rFonts w:ascii="Calibri" w:cs="Calibri" w:eastAsia="Calibri" w:hAnsi="Calibri"/>
+                <w:b w:val="false"/>
+                <w:bCs w:val="false"/>
+                <w:color w:val="2B2318"/>
+                <w:sz w:val="19"/>
+                <w:szCs w:val="19"/>
+              </w:rPr>
+              <w:t xml:space="preserve">☐</w:t>
+            </w:r>
+          </w:p>
+        </w:tc>
+        <w:tc>
+          <w:tcPr>
+            <w:tcW w:type="dxa" w:w="4406"/>
+            <w:tcBorders>
+              <w:top w:val="single" w:color="BFB5A5" w:sz="4"/>
+              <w:left w:val="single" w:color="BFB5A5" w:sz="4"/>
+              <w:bottom w:val="single" w:color="BFB5A5" w:sz="4"/>
+              <w:right w:val="single" w:color="BFB5A5" w:sz="4"/>
+            </w:tcBorders>
+            <w:tcMar>
+              <w:top w:type="dxa" w:w="50"/>
+              <w:left w:type="dxa" w:w="90"/>
+              <w:bottom w:type="dxa" w:w="50"/>
+              <w:right w:type="dxa" w:w="90"/>
+            </w:tcMar>
+          </w:tcPr>
+          <w:p>
+            <w:pPr>
+              <w:spacing w:after="0" w:before="0"/>
+              <w:jc w:val="center"/>
+            </w:pPr>
+            <w:r>
+              <w:rPr>
+                <w:rFonts w:ascii="Calibri" w:cs="Calibri" w:eastAsia="Calibri" w:hAnsi="Calibri"/>
+                <w:b w:val="false"/>
+                <w:bCs w:val="false"/>
+                <w:color w:val="2B2318"/>
+                <w:sz w:val="19"/>
+                <w:szCs w:val="19"/>
+              </w:rPr>
+              <w:t xml:space="preserve"/>
+            </w:r>
+          </w:p>
+        </w:tc>
+      </w:tr>
+      <w:tr>
+        <w:trPr>
+          <w:cantSplit/>
+          <w:trHeight w:val="700" w:hRule="atLeast"/>
+        </w:trPr>
+        <w:tc>
+          <w:tcPr>
+            <w:tcW w:type="dxa" w:w="4300"/>
+            <w:tcBorders>
+              <w:top w:val="single" w:color="BFB5A5" w:sz="4"/>
+              <w:left w:val="single" w:color="BFB5A5" w:sz="4"/>
+              <w:bottom w:val="single" w:color="BFB5A5" w:sz="4"/>
+              <w:right w:val="single" w:color="BFB5A5" w:sz="4"/>
+            </w:tcBorders>
+            <w:tcMar>
+              <w:top w:type="dxa" w:w="50"/>
+              <w:left w:type="dxa" w:w="90"/>
+              <w:bottom w:type="dxa" w:w="50"/>
+              <w:right w:type="dxa" w:w="90"/>
+            </w:tcMar>
+          </w:tcPr>
+          <w:p>
+            <w:pPr>
+              <w:spacing w:after="0" w:before="0"/>
+            </w:pPr>
+            <w:r>
+              <w:rPr>
+                <w:rFonts w:ascii="Calibri" w:cs="Calibri" w:eastAsia="Calibri" w:hAnsi="Calibri"/>
+                <w:b w:val="false"/>
+                <w:bCs w:val="false"/>
+                <w:color w:val="2B2318"/>
+                <w:sz w:val="19"/>
+                <w:szCs w:val="19"/>
+              </w:rPr>
+              <w:t xml:space="preserve">g) Aristokratie heißt übersetzt „Herrschaft der Besten“.</w:t>
+            </w:r>
+          </w:p>
+        </w:tc>
+        <w:tc>
+          <w:tcPr>
+            <w:tcW w:type="dxa" w:w="750"/>
+            <w:tcBorders>
+              <w:top w:val="single" w:color="BFB5A5" w:sz="4"/>
+              <w:left w:val="single" w:color="BFB5A5" w:sz="4"/>
+              <w:bottom w:val="single" w:color="BFB5A5" w:sz="4"/>
+              <w:right w:val="single" w:color="BFB5A5" w:sz="4"/>
+            </w:tcBorders>
+            <w:tcMar>
+              <w:top w:type="dxa" w:w="50"/>
+              <w:left w:type="dxa" w:w="90"/>
+              <w:bottom w:type="dxa" w:w="50"/>
+              <w:right w:type="dxa" w:w="90"/>
+            </w:tcMar>
+          </w:tcPr>
+          <w:p>
+            <w:pPr>
+              <w:spacing w:after="0" w:before="0"/>
+              <w:jc w:val="center"/>
+            </w:pPr>
+            <w:r>
+              <w:rPr>
+                <w:rFonts w:ascii="Calibri" w:cs="Calibri" w:eastAsia="Calibri" w:hAnsi="Calibri"/>
+                <w:b w:val="false"/>
+                <w:bCs w:val="false"/>
+                <w:color w:val="2B2318"/>
+                <w:sz w:val="19"/>
+                <w:szCs w:val="19"/>
+              </w:rPr>
+              <w:t xml:space="preserve">☐</w:t>
+            </w:r>
+          </w:p>
+        </w:tc>
+        <w:tc>
+          <w:tcPr>
+            <w:tcW w:type="dxa" w:w="750"/>
+            <w:tcBorders>
+              <w:top w:val="single" w:color="BFB5A5" w:sz="4"/>
+              <w:left w:val="single" w:color="BFB5A5" w:sz="4"/>
+              <w:bottom w:val="single" w:color="BFB5A5" w:sz="4"/>
+              <w:right w:val="single" w:color="BFB5A5" w:sz="4"/>
+            </w:tcBorders>
+            <w:tcMar>
+              <w:top w:type="dxa" w:w="50"/>
+              <w:left w:type="dxa" w:w="90"/>
+              <w:bottom w:type="dxa" w:w="50"/>
+              <w:right w:type="dxa" w:w="90"/>
+            </w:tcMar>
+          </w:tcPr>
+          <w:p>
+            <w:pPr>
+              <w:spacing w:after="0" w:before="0"/>
+              <w:jc w:val="center"/>
+            </w:pPr>
+            <w:r>
+              <w:rPr>
+                <w:rFonts w:ascii="Calibri" w:cs="Calibri" w:eastAsia="Calibri" w:hAnsi="Calibri"/>
+                <w:b w:val="false"/>
+                <w:bCs w:val="false"/>
+                <w:color w:val="2B2318"/>
+                <w:sz w:val="19"/>
+                <w:szCs w:val="19"/>
+              </w:rPr>
+              <w:t xml:space="preserve">☐</w:t>
+            </w:r>
+          </w:p>
+        </w:tc>
+        <w:tc>
+          <w:tcPr>
+            <w:tcW w:type="dxa" w:w="4406"/>
+            <w:tcBorders>
+              <w:top w:val="single" w:color="BFB5A5" w:sz="4"/>
+              <w:left w:val="single" w:color="BFB5A5" w:sz="4"/>
+              <w:bottom w:val="single" w:color="BFB5A5" w:sz="4"/>
+              <w:right w:val="single" w:color="BFB5A5" w:sz="4"/>
+            </w:tcBorders>
+            <w:tcMar>
+              <w:top w:type="dxa" w:w="50"/>
+              <w:left w:type="dxa" w:w="90"/>
+              <w:bottom w:type="dxa" w:w="50"/>
+              <w:right w:type="dxa" w:w="90"/>
+            </w:tcMar>
+          </w:tcPr>
+          <w:p>
+            <w:pPr>
+              <w:spacing w:after="0" w:before="0"/>
+              <w:jc w:val="center"/>
+            </w:pPr>
+            <w:r>
+              <w:rPr>
+                <w:rFonts w:ascii="Calibri" w:cs="Calibri" w:eastAsia="Calibri" w:hAnsi="Calibri"/>
+                <w:b w:val="false"/>
+                <w:bCs w:val="false"/>
+                <w:color w:val="2B2318"/>
+                <w:sz w:val="19"/>
+                <w:szCs w:val="19"/>
+              </w:rPr>
+              <w:t xml:space="preserve"/>
+            </w:r>
+          </w:p>
+        </w:tc>
+      </w:tr>
+      <w:tr>
+        <w:trPr>
+          <w:cantSplit/>
+          <w:trHeight w:val="700" w:hRule="atLeast"/>
+        </w:trPr>
+        <w:tc>
+          <w:tcPr>
+            <w:tcW w:type="dxa" w:w="4300"/>
+            <w:tcBorders>
+              <w:top w:val="single" w:color="BFB5A5" w:sz="4"/>
+              <w:left w:val="single" w:color="BFB5A5" w:sz="4"/>
+              <w:bottom w:val="single" w:color="BFB5A5" w:sz="4"/>
+              <w:right w:val="single" w:color="BFB5A5" w:sz="4"/>
+            </w:tcBorders>
+            <w:tcMar>
+              <w:top w:type="dxa" w:w="50"/>
+              <w:left w:type="dxa" w:w="90"/>
+              <w:bottom w:type="dxa" w:w="50"/>
+              <w:right w:type="dxa" w:w="90"/>
+            </w:tcMar>
+          </w:tcPr>
+          <w:p>
+            <w:pPr>
+              <w:spacing w:after="0" w:before="0"/>
+            </w:pPr>
+            <w:r>
+              <w:rPr>
+                <w:rFonts w:ascii="Calibri" w:cs="Calibri" w:eastAsia="Calibri" w:hAnsi="Calibri"/>
+                <w:b w:val="false"/>
+                <w:bCs w:val="false"/>
+                <w:color w:val="2B2318"/>
+                <w:sz w:val="19"/>
+                <w:szCs w:val="19"/>
+              </w:rPr>
+              <w:t xml:space="preserve">h) In einer Monarchie herrschen wenige Adelsfamilien gemeinsam.</w:t>
             </w:r>
           </w:p>
         </w:tc>

</xml_diff>